<commit_message>
insert header and footer through script
</commit_message>
<xml_diff>
--- a/תיעוד של האתר.docx
+++ b/תיעוד של האתר.docx
@@ -1,6 +1,6 @@
 
 <file path=word/document.xml><?xml version="1.0" encoding="utf-8"?>
-<w:document xmlns:wpc="http://schemas.microsoft.com/office/word/2010/wordprocessingCanvas" xmlns:cx="http://schemas.microsoft.com/office/drawing/2014/chartex" xmlns:cx1="http://schemas.microsoft.com/office/drawing/2015/9/8/chartex" xmlns:cx2="http://schemas.microsoft.com/office/drawing/2015/10/21/chartex" xmlns:cx3="http://schemas.microsoft.com/office/drawing/2016/5/9/chartex" xmlns:cx4="http://schemas.microsoft.com/office/drawing/2016/5/10/chartex" xmlns:cx5="http://schemas.microsoft.com/office/drawing/2016/5/11/chartex" xmlns:cx6="http://schemas.microsoft.com/office/drawing/2016/5/12/chartex" xmlns:cx7="http://schemas.microsoft.com/office/drawing/2016/5/13/chartex" xmlns:cx8="http://schemas.microsoft.com/office/drawing/2016/5/14/chartex" xmlns:mc="http://schemas.openxmlformats.org/markup-compatibility/2006" xmlns:aink="http://schemas.microsoft.com/office/drawing/2016/ink" xmlns:am3d="http://schemas.microsoft.com/office/drawing/2017/model3d" xmlns:o="urn:schemas-microsoft-com:office:office" xmlns:oel="http://schemas.microsoft.com/office/2019/extlst" xmlns:r="http://schemas.openxmlformats.org/officeDocument/2006/relationships" xmlns:m="http://schemas.openxmlformats.org/officeDocument/2006/math" xmlns:v="urn:schemas-microsoft-com:vml" xmlns:wp14="http://schemas.microsoft.com/office/word/2010/wordprocessingDrawing" xmlns:wp="http://schemas.openxmlformats.org/drawingml/2006/wordprocessingDrawing" xmlns:w10="urn:schemas-microsoft-com:office:word" xmlns:w="http://schemas.openxmlformats.org/wordprocessingml/2006/main" xmlns:w14="http://schemas.microsoft.com/office/word/2010/wordml" xmlns:w15="http://schemas.microsoft.com/office/word/2012/wordml" xmlns:w16cex="http://schemas.microsoft.com/office/word/2018/wordml/cex" xmlns:w16cid="http://schemas.microsoft.com/office/word/2016/wordml/cid" xmlns:w16="http://schemas.microsoft.com/office/word/2018/wordml" xmlns:w16du="http://schemas.microsoft.com/office/word/2023/wordml/word16du" xmlns:w16sdtdh="http://schemas.microsoft.com/office/word/2020/wordml/sdtdatahash" xmlns:w16sdtfl="http://schemas.microsoft.com/office/word/2024/wordml/sdtformatlock" xmlns:w16se="http://schemas.microsoft.com/office/word/2015/wordml/symex" xmlns:wpg="http://schemas.microsoft.com/office/word/2010/wordprocessingGroup" xmlns:wpi="http://schemas.microsoft.com/office/word/2010/wordprocessingInk" xmlns:wne="http://schemas.microsoft.com/office/word/2006/wordml" xmlns:wps="http://schemas.microsoft.com/office/word/2010/wordprocessingShape" mc:Ignorable="w14 w15 w16se w16cid w16 w16cex w16sdtdh w16sdtfl w16du wp14">
+<w:document xmlns:wpc="http://schemas.microsoft.com/office/word/2010/wordprocessingCanvas" xmlns:cx="http://schemas.microsoft.com/office/drawing/2014/chartex" xmlns:cx1="http://schemas.microsoft.com/office/drawing/2015/9/8/chartex" xmlns:cx2="http://schemas.microsoft.com/office/drawing/2015/10/21/chartex" xmlns:cx3="http://schemas.microsoft.com/office/drawing/2016/5/9/chartex" xmlns:cx4="http://schemas.microsoft.com/office/drawing/2016/5/10/chartex" xmlns:cx5="http://schemas.microsoft.com/office/drawing/2016/5/11/chartex" xmlns:cx6="http://schemas.microsoft.com/office/drawing/2016/5/12/chartex" xmlns:cx7="http://schemas.microsoft.com/office/drawing/2016/5/13/chartex" xmlns:cx8="http://schemas.microsoft.com/office/drawing/2016/5/14/chartex" xmlns:mc="http://schemas.openxmlformats.org/markup-compatibility/2006" xmlns:aink="http://schemas.microsoft.com/office/drawing/2016/ink" xmlns:am3d="http://schemas.microsoft.com/office/drawing/2017/model3d" xmlns:o="urn:schemas-microsoft-com:office:office" xmlns:r="http://schemas.openxmlformats.org/officeDocument/2006/relationships" xmlns:m="http://schemas.openxmlformats.org/officeDocument/2006/math" xmlns:v="urn:schemas-microsoft-com:vml" xmlns:wp14="http://schemas.microsoft.com/office/word/2010/wordprocessingDrawing" xmlns:wp="http://schemas.openxmlformats.org/drawingml/2006/wordprocessingDrawing" xmlns:w10="urn:schemas-microsoft-com:office:word" xmlns:w="http://schemas.openxmlformats.org/wordprocessingml/2006/main" xmlns:w14="http://schemas.microsoft.com/office/word/2010/wordml" xmlns:w15="http://schemas.microsoft.com/office/word/2012/wordml" xmlns:w16cex="http://schemas.microsoft.com/office/word/2018/wordml/cex" xmlns:w16cid="http://schemas.microsoft.com/office/word/2016/wordml/cid" xmlns:w16="http://schemas.microsoft.com/office/word/2018/wordml" xmlns:w16sdtdh="http://schemas.microsoft.com/office/word/2020/wordml/sdtdatahash" xmlns:w16se="http://schemas.microsoft.com/office/word/2015/wordml/symex" xmlns:wpg="http://schemas.microsoft.com/office/word/2010/wordprocessingGroup" xmlns:wpi="http://schemas.microsoft.com/office/word/2010/wordprocessingInk" xmlns:wne="http://schemas.microsoft.com/office/word/2006/wordml" xmlns:wps="http://schemas.microsoft.com/office/word/2010/wordprocessingShape" mc:Ignorable="w14 w15 w16se w16cid w16 w16cex w16sdtdh wp14">
   <w:body>
     <w:p>
       <w:pPr>
@@ -491,7 +491,6 @@
         <w:rPr>
           <w:sz w:val="28"/>
           <w:szCs w:val="28"/>
-          <w:rtl/>
         </w:rPr>
       </w:pPr>
       <w:r>
@@ -522,6 +521,31 @@
           <w:rtl/>
         </w:rPr>
       </w:pPr>
+      <w:r>
+        <w:rPr>
+          <w:sz w:val="28"/>
+          <w:szCs w:val="28"/>
+        </w:rPr>
+        <w:t>Javascript</w:t>
+      </w:r>
+      <w:r>
+        <w:rPr>
+          <w:rFonts w:hint="cs"/>
+          <w:sz w:val="28"/>
+          <w:szCs w:val="28"/>
+          <w:rtl/>
+        </w:rPr>
+        <w:t>........................................עמ</w:t>
+      </w:r>
+      <w:r>
+        <w:rPr>
+          <w:rFonts w:hint="cs"/>
+          <w:sz w:val="28"/>
+          <w:szCs w:val="28"/>
+          <w:rtl/>
+        </w:rPr>
+        <w:t>'</w:t>
+      </w:r>
     </w:p>
     <w:p>
       <w:pPr>
@@ -1217,6 +1241,7 @@
           <w:rFonts w:hint="cs"/>
           <w:rtl/>
         </w:rPr>
+        <w:lastRenderedPageBreak/>
         <w:t>מעבר בין עמודים על ידי קליטת הל</w:t>
       </w:r>
       <w:r>
@@ -1245,7 +1270,6 @@
           <w:u w:val="single"/>
           <w:rtl/>
         </w:rPr>
-        <w:lastRenderedPageBreak/>
         <w:t>עמוד</w:t>
       </w:r>
       <w:r>
@@ -1866,7 +1890,6 @@
           <w:u w:val="single"/>
           <w:rtl/>
         </w:rPr>
-        <w:lastRenderedPageBreak/>
         <w:t>עמוד</w:t>
       </w:r>
       <w:r>
@@ -2368,6 +2391,7 @@
           <w:rFonts w:hint="cs"/>
           <w:rtl/>
         </w:rPr>
+        <w:lastRenderedPageBreak/>
         <w:t>מעבר בין עמודים על ידי קליטת הלחיצות של הכפתורים.</w:t>
       </w:r>
     </w:p>
@@ -2389,7 +2413,6 @@
           <w:u w:val="single"/>
           <w:rtl/>
         </w:rPr>
-        <w:lastRenderedPageBreak/>
         <w:t>עמוד</w:t>
       </w:r>
       <w:r>
@@ -4905,7 +4928,237 @@
     <w:p>
       <w:pPr>
         <w:bidi/>
-      </w:pPr>
+        <w:rPr>
+          <w:rtl/>
+        </w:rPr>
+      </w:pPr>
+    </w:p>
+    <w:p>
+      <w:pPr>
+        <w:bidi/>
+        <w:rPr>
+          <w:rtl/>
+        </w:rPr>
+      </w:pPr>
+    </w:p>
+    <w:p>
+      <w:pPr>
+        <w:bidi/>
+        <w:rPr>
+          <w:rtl/>
+        </w:rPr>
+      </w:pPr>
+    </w:p>
+    <w:p>
+      <w:pPr>
+        <w:bidi/>
+        <w:rPr>
+          <w:rtl/>
+        </w:rPr>
+      </w:pPr>
+    </w:p>
+    <w:p>
+      <w:pPr>
+        <w:bidi/>
+        <w:rPr>
+          <w:rtl/>
+        </w:rPr>
+      </w:pPr>
+    </w:p>
+    <w:p>
+      <w:pPr>
+        <w:bidi/>
+        <w:rPr>
+          <w:rtl/>
+        </w:rPr>
+      </w:pPr>
+    </w:p>
+    <w:p>
+      <w:pPr>
+        <w:bidi/>
+        <w:rPr>
+          <w:rtl/>
+        </w:rPr>
+      </w:pPr>
+    </w:p>
+    <w:p>
+      <w:pPr>
+        <w:bidi/>
+        <w:rPr>
+          <w:rtl/>
+        </w:rPr>
+      </w:pPr>
+    </w:p>
+    <w:p>
+      <w:pPr>
+        <w:bidi/>
+        <w:rPr>
+          <w:rtl/>
+        </w:rPr>
+      </w:pPr>
+    </w:p>
+    <w:p>
+      <w:pPr>
+        <w:bidi/>
+        <w:rPr>
+          <w:rtl/>
+        </w:rPr>
+      </w:pPr>
+    </w:p>
+    <w:p>
+      <w:pPr>
+        <w:bidi/>
+        <w:rPr>
+          <w:rtl/>
+        </w:rPr>
+      </w:pPr>
+    </w:p>
+    <w:p>
+      <w:pPr>
+        <w:bidi/>
+        <w:rPr>
+          <w:rtl/>
+        </w:rPr>
+      </w:pPr>
+    </w:p>
+    <w:p>
+      <w:pPr>
+        <w:bidi/>
+        <w:rPr>
+          <w:sz w:val="44"/>
+          <w:szCs w:val="44"/>
+          <w:u w:val="single"/>
+        </w:rPr>
+      </w:pPr>
+    </w:p>
+    <w:p>
+      <w:pPr>
+        <w:bidi/>
+        <w:rPr>
+          <w:sz w:val="44"/>
+          <w:szCs w:val="44"/>
+        </w:rPr>
+      </w:pPr>
+      <w:r>
+        <w:rPr>
+          <w:sz w:val="44"/>
+          <w:szCs w:val="44"/>
+          <w:u w:val="single"/>
+        </w:rPr>
+        <w:lastRenderedPageBreak/>
+        <w:t>Javascrip</w:t>
+      </w:r>
+      <w:r>
+        <w:rPr>
+          <w:sz w:val="44"/>
+          <w:szCs w:val="44"/>
+          <w:u w:val="single"/>
+        </w:rPr>
+        <w:t>t</w:t>
+      </w:r>
+      <w:r>
+        <w:rPr>
+          <w:rFonts w:hint="cs"/>
+          <w:sz w:val="44"/>
+          <w:szCs w:val="44"/>
+          <w:rtl/>
+        </w:rPr>
+        <w:t>:</w:t>
+      </w:r>
+    </w:p>
+    <w:p>
+      <w:pPr>
+        <w:bidi/>
+        <w:rPr>
+          <w:sz w:val="36"/>
+          <w:szCs w:val="28"/>
+        </w:rPr>
+      </w:pPr>
+      <w:r>
+        <w:rPr>
+          <w:rFonts w:hint="cs"/>
+          <w:sz w:val="36"/>
+          <w:szCs w:val="28"/>
+          <w:rtl/>
+        </w:rPr>
+        <w:t xml:space="preserve">קרוסלה של תמונות </w:t>
+      </w:r>
+      <w:r>
+        <w:rPr>
+          <w:sz w:val="36"/>
+          <w:szCs w:val="28"/>
+          <w:rtl/>
+        </w:rPr>
+        <w:t>–</w:t>
+      </w:r>
+      <w:r>
+        <w:rPr>
+          <w:rFonts w:hint="cs"/>
+          <w:sz w:val="36"/>
+          <w:szCs w:val="28"/>
+          <w:rtl/>
+        </w:rPr>
+        <w:t xml:space="preserve"> כל עמוד עם הסקריפט יוכל להוסיף </w:t>
+      </w:r>
+      <w:r>
+        <w:rPr>
+          <w:sz w:val="36"/>
+          <w:szCs w:val="28"/>
+        </w:rPr>
+        <w:t>div</w:t>
+      </w:r>
+      <w:r>
+        <w:rPr>
+          <w:rFonts w:hint="cs"/>
+          <w:sz w:val="36"/>
+          <w:szCs w:val="28"/>
+          <w:rtl/>
+        </w:rPr>
+        <w:t xml:space="preserve"> עם תמונות שיתחלפו ביניהם כל 3 שניות.</w:t>
+      </w:r>
+    </w:p>
+    <w:p>
+      <w:pPr>
+        <w:bidi/>
+        <w:rPr>
+          <w:sz w:val="36"/>
+          <w:szCs w:val="28"/>
+        </w:rPr>
+      </w:pPr>
+    </w:p>
+    <w:p>
+      <w:pPr>
+        <w:bidi/>
+        <w:rPr>
+          <w:rFonts w:hint="cs"/>
+          <w:rtl/>
+        </w:rPr>
+      </w:pPr>
+      <w:r>
+        <w:rPr>
+          <w:rFonts w:hint="cs"/>
+          <w:sz w:val="36"/>
+          <w:szCs w:val="28"/>
+          <w:rtl/>
+        </w:rPr>
+        <w:t xml:space="preserve">הוספת </w:t>
+      </w:r>
+      <w:r>
+        <w:rPr>
+          <w:sz w:val="36"/>
+          <w:szCs w:val="28"/>
+        </w:rPr>
+        <w:t>header/footer</w:t>
+      </w:r>
+      <w:r>
+        <w:rPr>
+          <w:rFonts w:hint="cs"/>
+          <w:sz w:val="36"/>
+          <w:szCs w:val="28"/>
+          <w:rtl/>
+        </w:rPr>
+        <w:t xml:space="preserve"> אוטומטי</w:t>
+      </w:r>
     </w:p>
     <w:sectPr>
       <w:footerReference w:type="default" r:id="rId7"/>
@@ -4921,7 +5174,7 @@
 </file>
 
 <file path=word/endnotes.xml><?xml version="1.0" encoding="utf-8"?>
-<w:endnotes xmlns:wpc="http://schemas.microsoft.com/office/word/2010/wordprocessingCanvas" xmlns:cx="http://schemas.microsoft.com/office/drawing/2014/chartex" xmlns:cx1="http://schemas.microsoft.com/office/drawing/2015/9/8/chartex" xmlns:cx2="http://schemas.microsoft.com/office/drawing/2015/10/21/chartex" xmlns:cx3="http://schemas.microsoft.com/office/drawing/2016/5/9/chartex" xmlns:cx4="http://schemas.microsoft.com/office/drawing/2016/5/10/chartex" xmlns:cx5="http://schemas.microsoft.com/office/drawing/2016/5/11/chartex" xmlns:cx6="http://schemas.microsoft.com/office/drawing/2016/5/12/chartex" xmlns:cx7="http://schemas.microsoft.com/office/drawing/2016/5/13/chartex" xmlns:cx8="http://schemas.microsoft.com/office/drawing/2016/5/14/chartex" xmlns:mc="http://schemas.openxmlformats.org/markup-compatibility/2006" xmlns:aink="http://schemas.microsoft.com/office/drawing/2016/ink" xmlns:am3d="http://schemas.microsoft.com/office/drawing/2017/model3d" xmlns:o="urn:schemas-microsoft-com:office:office" xmlns:oel="http://schemas.microsoft.com/office/2019/extlst" xmlns:r="http://schemas.openxmlformats.org/officeDocument/2006/relationships" xmlns:m="http://schemas.openxmlformats.org/officeDocument/2006/math" xmlns:v="urn:schemas-microsoft-com:vml" xmlns:wp14="http://schemas.microsoft.com/office/word/2010/wordprocessingDrawing" xmlns:wp="http://schemas.openxmlformats.org/drawingml/2006/wordprocessingDrawing" xmlns:w10="urn:schemas-microsoft-com:office:word" xmlns:w="http://schemas.openxmlformats.org/wordprocessingml/2006/main" xmlns:w14="http://schemas.microsoft.com/office/word/2010/wordml" xmlns:w15="http://schemas.microsoft.com/office/word/2012/wordml" xmlns:w16cex="http://schemas.microsoft.com/office/word/2018/wordml/cex" xmlns:w16cid="http://schemas.microsoft.com/office/word/2016/wordml/cid" xmlns:w16="http://schemas.microsoft.com/office/word/2018/wordml" xmlns:w16du="http://schemas.microsoft.com/office/word/2023/wordml/word16du" xmlns:w16sdtdh="http://schemas.microsoft.com/office/word/2020/wordml/sdtdatahash" xmlns:w16sdtfl="http://schemas.microsoft.com/office/word/2024/wordml/sdtformatlock" xmlns:w16se="http://schemas.microsoft.com/office/word/2015/wordml/symex" xmlns:wpg="http://schemas.microsoft.com/office/word/2010/wordprocessingGroup" xmlns:wpi="http://schemas.microsoft.com/office/word/2010/wordprocessingInk" xmlns:wne="http://schemas.microsoft.com/office/word/2006/wordml" xmlns:wps="http://schemas.microsoft.com/office/word/2010/wordprocessingShape" mc:Ignorable="w14 w15 w16se w16cid w16 w16cex w16sdtdh w16sdtfl w16du wp14">
+<w:endnotes xmlns:wpc="http://schemas.microsoft.com/office/word/2010/wordprocessingCanvas" xmlns:cx="http://schemas.microsoft.com/office/drawing/2014/chartex" xmlns:cx1="http://schemas.microsoft.com/office/drawing/2015/9/8/chartex" xmlns:cx2="http://schemas.microsoft.com/office/drawing/2015/10/21/chartex" xmlns:cx3="http://schemas.microsoft.com/office/drawing/2016/5/9/chartex" xmlns:cx4="http://schemas.microsoft.com/office/drawing/2016/5/10/chartex" xmlns:cx5="http://schemas.microsoft.com/office/drawing/2016/5/11/chartex" xmlns:cx6="http://schemas.microsoft.com/office/drawing/2016/5/12/chartex" xmlns:cx7="http://schemas.microsoft.com/office/drawing/2016/5/13/chartex" xmlns:cx8="http://schemas.microsoft.com/office/drawing/2016/5/14/chartex" xmlns:mc="http://schemas.openxmlformats.org/markup-compatibility/2006" xmlns:aink="http://schemas.microsoft.com/office/drawing/2016/ink" xmlns:am3d="http://schemas.microsoft.com/office/drawing/2017/model3d" xmlns:o="urn:schemas-microsoft-com:office:office" xmlns:r="http://schemas.openxmlformats.org/officeDocument/2006/relationships" xmlns:m="http://schemas.openxmlformats.org/officeDocument/2006/math" xmlns:v="urn:schemas-microsoft-com:vml" xmlns:wp14="http://schemas.microsoft.com/office/word/2010/wordprocessingDrawing" xmlns:wp="http://schemas.openxmlformats.org/drawingml/2006/wordprocessingDrawing" xmlns:w10="urn:schemas-microsoft-com:office:word" xmlns:w="http://schemas.openxmlformats.org/wordprocessingml/2006/main" xmlns:w14="http://schemas.microsoft.com/office/word/2010/wordml" xmlns:w15="http://schemas.microsoft.com/office/word/2012/wordml" xmlns:w16cex="http://schemas.microsoft.com/office/word/2018/wordml/cex" xmlns:w16cid="http://schemas.microsoft.com/office/word/2016/wordml/cid" xmlns:w16="http://schemas.microsoft.com/office/word/2018/wordml" xmlns:w16sdtdh="http://schemas.microsoft.com/office/word/2020/wordml/sdtdatahash" xmlns:w16se="http://schemas.microsoft.com/office/word/2015/wordml/symex" xmlns:wpg="http://schemas.microsoft.com/office/word/2010/wordprocessingGroup" xmlns:wpi="http://schemas.microsoft.com/office/word/2010/wordprocessingInk" xmlns:wne="http://schemas.microsoft.com/office/word/2006/wordml" xmlns:wps="http://schemas.microsoft.com/office/word/2010/wordprocessingShape" mc:Ignorable="w14 w15 w16se w16cid w16 w16cex w16sdtdh wp14">
   <w:endnote w:type="separator" w:id="-1">
     <w:p>
       <w:pPr>
@@ -4946,7 +5199,7 @@
 </file>
 
 <file path=word/footer1.xml><?xml version="1.0" encoding="utf-8"?>
-<w:ftr xmlns:wpc="http://schemas.microsoft.com/office/word/2010/wordprocessingCanvas" xmlns:cx="http://schemas.microsoft.com/office/drawing/2014/chartex" xmlns:cx1="http://schemas.microsoft.com/office/drawing/2015/9/8/chartex" xmlns:cx2="http://schemas.microsoft.com/office/drawing/2015/10/21/chartex" xmlns:cx3="http://schemas.microsoft.com/office/drawing/2016/5/9/chartex" xmlns:cx4="http://schemas.microsoft.com/office/drawing/2016/5/10/chartex" xmlns:cx5="http://schemas.microsoft.com/office/drawing/2016/5/11/chartex" xmlns:cx6="http://schemas.microsoft.com/office/drawing/2016/5/12/chartex" xmlns:cx7="http://schemas.microsoft.com/office/drawing/2016/5/13/chartex" xmlns:cx8="http://schemas.microsoft.com/office/drawing/2016/5/14/chartex" xmlns:mc="http://schemas.openxmlformats.org/markup-compatibility/2006" xmlns:aink="http://schemas.microsoft.com/office/drawing/2016/ink" xmlns:am3d="http://schemas.microsoft.com/office/drawing/2017/model3d" xmlns:o="urn:schemas-microsoft-com:office:office" xmlns:oel="http://schemas.microsoft.com/office/2019/extlst" xmlns:r="http://schemas.openxmlformats.org/officeDocument/2006/relationships" xmlns:m="http://schemas.openxmlformats.org/officeDocument/2006/math" xmlns:v="urn:schemas-microsoft-com:vml" xmlns:wp14="http://schemas.microsoft.com/office/word/2010/wordprocessingDrawing" xmlns:wp="http://schemas.openxmlformats.org/drawingml/2006/wordprocessingDrawing" xmlns:w10="urn:schemas-microsoft-com:office:word" xmlns:w="http://schemas.openxmlformats.org/wordprocessingml/2006/main" xmlns:w14="http://schemas.microsoft.com/office/word/2010/wordml" xmlns:w15="http://schemas.microsoft.com/office/word/2012/wordml" xmlns:w16cex="http://schemas.microsoft.com/office/word/2018/wordml/cex" xmlns:w16cid="http://schemas.microsoft.com/office/word/2016/wordml/cid" xmlns:w16="http://schemas.microsoft.com/office/word/2018/wordml" xmlns:w16du="http://schemas.microsoft.com/office/word/2023/wordml/word16du" xmlns:w16sdtdh="http://schemas.microsoft.com/office/word/2020/wordml/sdtdatahash" xmlns:w16sdtfl="http://schemas.microsoft.com/office/word/2024/wordml/sdtformatlock" xmlns:w16se="http://schemas.microsoft.com/office/word/2015/wordml/symex" xmlns:wpg="http://schemas.microsoft.com/office/word/2010/wordprocessingGroup" xmlns:wpi="http://schemas.microsoft.com/office/word/2010/wordprocessingInk" xmlns:wne="http://schemas.microsoft.com/office/word/2006/wordml" xmlns:wps="http://schemas.microsoft.com/office/word/2010/wordprocessingShape" mc:Ignorable="w14 w15 w16se w16cid w16 w16cex w16sdtdh w16sdtfl w16du wp14">
+<w:ftr xmlns:wpc="http://schemas.microsoft.com/office/word/2010/wordprocessingCanvas" xmlns:cx="http://schemas.microsoft.com/office/drawing/2014/chartex" xmlns:cx1="http://schemas.microsoft.com/office/drawing/2015/9/8/chartex" xmlns:cx2="http://schemas.microsoft.com/office/drawing/2015/10/21/chartex" xmlns:cx3="http://schemas.microsoft.com/office/drawing/2016/5/9/chartex" xmlns:cx4="http://schemas.microsoft.com/office/drawing/2016/5/10/chartex" xmlns:cx5="http://schemas.microsoft.com/office/drawing/2016/5/11/chartex" xmlns:cx6="http://schemas.microsoft.com/office/drawing/2016/5/12/chartex" xmlns:cx7="http://schemas.microsoft.com/office/drawing/2016/5/13/chartex" xmlns:cx8="http://schemas.microsoft.com/office/drawing/2016/5/14/chartex" xmlns:mc="http://schemas.openxmlformats.org/markup-compatibility/2006" xmlns:aink="http://schemas.microsoft.com/office/drawing/2016/ink" xmlns:am3d="http://schemas.microsoft.com/office/drawing/2017/model3d" xmlns:o="urn:schemas-microsoft-com:office:office" xmlns:r="http://schemas.openxmlformats.org/officeDocument/2006/relationships" xmlns:m="http://schemas.openxmlformats.org/officeDocument/2006/math" xmlns:v="urn:schemas-microsoft-com:vml" xmlns:wp14="http://schemas.microsoft.com/office/word/2010/wordprocessingDrawing" xmlns:wp="http://schemas.openxmlformats.org/drawingml/2006/wordprocessingDrawing" xmlns:w10="urn:schemas-microsoft-com:office:word" xmlns:w="http://schemas.openxmlformats.org/wordprocessingml/2006/main" xmlns:w14="http://schemas.microsoft.com/office/word/2010/wordml" xmlns:w15="http://schemas.microsoft.com/office/word/2012/wordml" xmlns:w16cex="http://schemas.microsoft.com/office/word/2018/wordml/cex" xmlns:w16cid="http://schemas.microsoft.com/office/word/2016/wordml/cid" xmlns:w16="http://schemas.microsoft.com/office/word/2018/wordml" xmlns:w16sdtdh="http://schemas.microsoft.com/office/word/2020/wordml/sdtdatahash" xmlns:w16se="http://schemas.microsoft.com/office/word/2015/wordml/symex" xmlns:wpg="http://schemas.microsoft.com/office/word/2010/wordprocessingGroup" xmlns:wpi="http://schemas.microsoft.com/office/word/2010/wordprocessingInk" xmlns:wne="http://schemas.microsoft.com/office/word/2006/wordml" xmlns:wps="http://schemas.microsoft.com/office/word/2010/wordprocessingShape" mc:Ignorable="w14 w15 w16se w16cid w16 w16cex w16sdtdh wp14">
   <w:sdt>
     <w:sdtPr>
       <w:id w:val="248321040"/>
@@ -4999,7 +5252,7 @@
 </file>
 
 <file path=word/footnotes.xml><?xml version="1.0" encoding="utf-8"?>
-<w:footnotes xmlns:wpc="http://schemas.microsoft.com/office/word/2010/wordprocessingCanvas" xmlns:cx="http://schemas.microsoft.com/office/drawing/2014/chartex" xmlns:cx1="http://schemas.microsoft.com/office/drawing/2015/9/8/chartex" xmlns:cx2="http://schemas.microsoft.com/office/drawing/2015/10/21/chartex" xmlns:cx3="http://schemas.microsoft.com/office/drawing/2016/5/9/chartex" xmlns:cx4="http://schemas.microsoft.com/office/drawing/2016/5/10/chartex" xmlns:cx5="http://schemas.microsoft.com/office/drawing/2016/5/11/chartex" xmlns:cx6="http://schemas.microsoft.com/office/drawing/2016/5/12/chartex" xmlns:cx7="http://schemas.microsoft.com/office/drawing/2016/5/13/chartex" xmlns:cx8="http://schemas.microsoft.com/office/drawing/2016/5/14/chartex" xmlns:mc="http://schemas.openxmlformats.org/markup-compatibility/2006" xmlns:aink="http://schemas.microsoft.com/office/drawing/2016/ink" xmlns:am3d="http://schemas.microsoft.com/office/drawing/2017/model3d" xmlns:o="urn:schemas-microsoft-com:office:office" xmlns:oel="http://schemas.microsoft.com/office/2019/extlst" xmlns:r="http://schemas.openxmlformats.org/officeDocument/2006/relationships" xmlns:m="http://schemas.openxmlformats.org/officeDocument/2006/math" xmlns:v="urn:schemas-microsoft-com:vml" xmlns:wp14="http://schemas.microsoft.com/office/word/2010/wordprocessingDrawing" xmlns:wp="http://schemas.openxmlformats.org/drawingml/2006/wordprocessingDrawing" xmlns:w10="urn:schemas-microsoft-com:office:word" xmlns:w="http://schemas.openxmlformats.org/wordprocessingml/2006/main" xmlns:w14="http://schemas.microsoft.com/office/word/2010/wordml" xmlns:w15="http://schemas.microsoft.com/office/word/2012/wordml" xmlns:w16cex="http://schemas.microsoft.com/office/word/2018/wordml/cex" xmlns:w16cid="http://schemas.microsoft.com/office/word/2016/wordml/cid" xmlns:w16="http://schemas.microsoft.com/office/word/2018/wordml" xmlns:w16du="http://schemas.microsoft.com/office/word/2023/wordml/word16du" xmlns:w16sdtdh="http://schemas.microsoft.com/office/word/2020/wordml/sdtdatahash" xmlns:w16sdtfl="http://schemas.microsoft.com/office/word/2024/wordml/sdtformatlock" xmlns:w16se="http://schemas.microsoft.com/office/word/2015/wordml/symex" xmlns:wpg="http://schemas.microsoft.com/office/word/2010/wordprocessingGroup" xmlns:wpi="http://schemas.microsoft.com/office/word/2010/wordprocessingInk" xmlns:wne="http://schemas.microsoft.com/office/word/2006/wordml" xmlns:wps="http://schemas.microsoft.com/office/word/2010/wordprocessingShape" mc:Ignorable="w14 w15 w16se w16cid w16 w16cex w16sdtdh w16sdtfl w16du wp14">
+<w:footnotes xmlns:wpc="http://schemas.microsoft.com/office/word/2010/wordprocessingCanvas" xmlns:cx="http://schemas.microsoft.com/office/drawing/2014/chartex" xmlns:cx1="http://schemas.microsoft.com/office/drawing/2015/9/8/chartex" xmlns:cx2="http://schemas.microsoft.com/office/drawing/2015/10/21/chartex" xmlns:cx3="http://schemas.microsoft.com/office/drawing/2016/5/9/chartex" xmlns:cx4="http://schemas.microsoft.com/office/drawing/2016/5/10/chartex" xmlns:cx5="http://schemas.microsoft.com/office/drawing/2016/5/11/chartex" xmlns:cx6="http://schemas.microsoft.com/office/drawing/2016/5/12/chartex" xmlns:cx7="http://schemas.microsoft.com/office/drawing/2016/5/13/chartex" xmlns:cx8="http://schemas.microsoft.com/office/drawing/2016/5/14/chartex" xmlns:mc="http://schemas.openxmlformats.org/markup-compatibility/2006" xmlns:aink="http://schemas.microsoft.com/office/drawing/2016/ink" xmlns:am3d="http://schemas.microsoft.com/office/drawing/2017/model3d" xmlns:o="urn:schemas-microsoft-com:office:office" xmlns:r="http://schemas.openxmlformats.org/officeDocument/2006/relationships" xmlns:m="http://schemas.openxmlformats.org/officeDocument/2006/math" xmlns:v="urn:schemas-microsoft-com:vml" xmlns:wp14="http://schemas.microsoft.com/office/word/2010/wordprocessingDrawing" xmlns:wp="http://schemas.openxmlformats.org/drawingml/2006/wordprocessingDrawing" xmlns:w10="urn:schemas-microsoft-com:office:word" xmlns:w="http://schemas.openxmlformats.org/wordprocessingml/2006/main" xmlns:w14="http://schemas.microsoft.com/office/word/2010/wordml" xmlns:w15="http://schemas.microsoft.com/office/word/2012/wordml" xmlns:w16cex="http://schemas.microsoft.com/office/word/2018/wordml/cex" xmlns:w16cid="http://schemas.microsoft.com/office/word/2016/wordml/cid" xmlns:w16="http://schemas.microsoft.com/office/word/2018/wordml" xmlns:w16sdtdh="http://schemas.microsoft.com/office/word/2020/wordml/sdtdatahash" xmlns:w16se="http://schemas.microsoft.com/office/word/2015/wordml/symex" xmlns:wpg="http://schemas.microsoft.com/office/word/2010/wordprocessingGroup" xmlns:wpi="http://schemas.microsoft.com/office/word/2010/wordprocessingInk" xmlns:wne="http://schemas.microsoft.com/office/word/2006/wordml" xmlns:wps="http://schemas.microsoft.com/office/word/2010/wordprocessingShape" mc:Ignorable="w14 w15 w16se w16cid w16 w16cex w16sdtdh wp14">
   <w:footnote w:type="separator" w:id="-1">
     <w:p>
       <w:pPr>
@@ -5024,7 +5277,7 @@
 </file>
 
 <file path=word/numbering.xml><?xml version="1.0" encoding="utf-8"?>
-<w:numbering xmlns:wpc="http://schemas.microsoft.com/office/word/2010/wordprocessingCanvas" xmlns:cx="http://schemas.microsoft.com/office/drawing/2014/chartex" xmlns:cx1="http://schemas.microsoft.com/office/drawing/2015/9/8/chartex" xmlns:cx2="http://schemas.microsoft.com/office/drawing/2015/10/21/chartex" xmlns:cx3="http://schemas.microsoft.com/office/drawing/2016/5/9/chartex" xmlns:cx4="http://schemas.microsoft.com/office/drawing/2016/5/10/chartex" xmlns:cx5="http://schemas.microsoft.com/office/drawing/2016/5/11/chartex" xmlns:cx6="http://schemas.microsoft.com/office/drawing/2016/5/12/chartex" xmlns:cx7="http://schemas.microsoft.com/office/drawing/2016/5/13/chartex" xmlns:cx8="http://schemas.microsoft.com/office/drawing/2016/5/14/chartex" xmlns:mc="http://schemas.openxmlformats.org/markup-compatibility/2006" xmlns:aink="http://schemas.microsoft.com/office/drawing/2016/ink" xmlns:am3d="http://schemas.microsoft.com/office/drawing/2017/model3d" xmlns:o="urn:schemas-microsoft-com:office:office" xmlns:oel="http://schemas.microsoft.com/office/2019/extlst" xmlns:r="http://schemas.openxmlformats.org/officeDocument/2006/relationships" xmlns:m="http://schemas.openxmlformats.org/officeDocument/2006/math" xmlns:v="urn:schemas-microsoft-com:vml" xmlns:wp14="http://schemas.microsoft.com/office/word/2010/wordprocessingDrawing" xmlns:wp="http://schemas.openxmlformats.org/drawingml/2006/wordprocessingDrawing" xmlns:w10="urn:schemas-microsoft-com:office:word" xmlns:w="http://schemas.openxmlformats.org/wordprocessingml/2006/main" xmlns:w14="http://schemas.microsoft.com/office/word/2010/wordml" xmlns:w15="http://schemas.microsoft.com/office/word/2012/wordml" xmlns:w16cex="http://schemas.microsoft.com/office/word/2018/wordml/cex" xmlns:w16cid="http://schemas.microsoft.com/office/word/2016/wordml/cid" xmlns:w16="http://schemas.microsoft.com/office/word/2018/wordml" xmlns:w16du="http://schemas.microsoft.com/office/word/2023/wordml/word16du" xmlns:w16sdtdh="http://schemas.microsoft.com/office/word/2020/wordml/sdtdatahash" xmlns:w16sdtfl="http://schemas.microsoft.com/office/word/2024/wordml/sdtformatlock" xmlns:w16se="http://schemas.microsoft.com/office/word/2015/wordml/symex" xmlns:wpg="http://schemas.microsoft.com/office/word/2010/wordprocessingGroup" xmlns:wpi="http://schemas.microsoft.com/office/word/2010/wordprocessingInk" xmlns:wne="http://schemas.microsoft.com/office/word/2006/wordml" xmlns:wps="http://schemas.microsoft.com/office/word/2010/wordprocessingShape" mc:Ignorable="w14 w15 w16se w16cid w16 w16cex w16sdtdh w16sdtfl w16du wp14">
+<w:numbering xmlns:wpc="http://schemas.microsoft.com/office/word/2010/wordprocessingCanvas" xmlns:cx="http://schemas.microsoft.com/office/drawing/2014/chartex" xmlns:cx1="http://schemas.microsoft.com/office/drawing/2015/9/8/chartex" xmlns:cx2="http://schemas.microsoft.com/office/drawing/2015/10/21/chartex" xmlns:cx3="http://schemas.microsoft.com/office/drawing/2016/5/9/chartex" xmlns:cx4="http://schemas.microsoft.com/office/drawing/2016/5/10/chartex" xmlns:cx5="http://schemas.microsoft.com/office/drawing/2016/5/11/chartex" xmlns:cx6="http://schemas.microsoft.com/office/drawing/2016/5/12/chartex" xmlns:cx7="http://schemas.microsoft.com/office/drawing/2016/5/13/chartex" xmlns:cx8="http://schemas.microsoft.com/office/drawing/2016/5/14/chartex" xmlns:mc="http://schemas.openxmlformats.org/markup-compatibility/2006" xmlns:aink="http://schemas.microsoft.com/office/drawing/2016/ink" xmlns:am3d="http://schemas.microsoft.com/office/drawing/2017/model3d" xmlns:o="urn:schemas-microsoft-com:office:office" xmlns:r="http://schemas.openxmlformats.org/officeDocument/2006/relationships" xmlns:m="http://schemas.openxmlformats.org/officeDocument/2006/math" xmlns:v="urn:schemas-microsoft-com:vml" xmlns:wp14="http://schemas.microsoft.com/office/word/2010/wordprocessingDrawing" xmlns:wp="http://schemas.openxmlformats.org/drawingml/2006/wordprocessingDrawing" xmlns:w10="urn:schemas-microsoft-com:office:word" xmlns:w="http://schemas.openxmlformats.org/wordprocessingml/2006/main" xmlns:w14="http://schemas.microsoft.com/office/word/2010/wordml" xmlns:w15="http://schemas.microsoft.com/office/word/2012/wordml" xmlns:w16cex="http://schemas.microsoft.com/office/word/2018/wordml/cex" xmlns:w16cid="http://schemas.microsoft.com/office/word/2016/wordml/cid" xmlns:w16="http://schemas.microsoft.com/office/word/2018/wordml" xmlns:w16sdtdh="http://schemas.microsoft.com/office/word/2020/wordml/sdtdatahash" xmlns:w16se="http://schemas.microsoft.com/office/word/2015/wordml/symex" xmlns:wpg="http://schemas.microsoft.com/office/word/2010/wordprocessingGroup" xmlns:wpi="http://schemas.microsoft.com/office/word/2010/wordprocessingInk" xmlns:wne="http://schemas.microsoft.com/office/word/2006/wordml" xmlns:wps="http://schemas.microsoft.com/office/word/2010/wordprocessingShape" mc:Ignorable="w14 w15 w16se w16cid w16 w16cex w16sdtdh wp14">
   <w:abstractNum w:abstractNumId="0" w15:restartNumberingAfterBreak="0">
     <w:nsid w:val="0B35142C"/>
     <w:multiLevelType w:val="hybridMultilevel"/>
@@ -6384,56 +6637,56 @@
       </w:pPr>
     </w:lvl>
   </w:abstractNum>
-  <w:num w:numId="1" w16cid:durableId="1467091464">
+  <w:num w:numId="1">
     <w:abstractNumId w:val="8"/>
   </w:num>
-  <w:num w:numId="2" w16cid:durableId="77677424">
+  <w:num w:numId="2">
     <w:abstractNumId w:val="11"/>
   </w:num>
-  <w:num w:numId="3" w16cid:durableId="1869219284">
+  <w:num w:numId="3">
     <w:abstractNumId w:val="7"/>
   </w:num>
-  <w:num w:numId="4" w16cid:durableId="2135636653">
+  <w:num w:numId="4">
     <w:abstractNumId w:val="6"/>
   </w:num>
-  <w:num w:numId="5" w16cid:durableId="670255249">
+  <w:num w:numId="5">
     <w:abstractNumId w:val="2"/>
   </w:num>
-  <w:num w:numId="6" w16cid:durableId="760838576">
+  <w:num w:numId="6">
     <w:abstractNumId w:val="5"/>
   </w:num>
-  <w:num w:numId="7" w16cid:durableId="1644654004">
+  <w:num w:numId="7">
     <w:abstractNumId w:val="13"/>
   </w:num>
-  <w:num w:numId="8" w16cid:durableId="1183200637">
+  <w:num w:numId="8">
     <w:abstractNumId w:val="3"/>
   </w:num>
-  <w:num w:numId="9" w16cid:durableId="63919139">
+  <w:num w:numId="9">
     <w:abstractNumId w:val="12"/>
   </w:num>
-  <w:num w:numId="10" w16cid:durableId="914969883">
+  <w:num w:numId="10">
     <w:abstractNumId w:val="14"/>
   </w:num>
-  <w:num w:numId="11" w16cid:durableId="1016540811">
+  <w:num w:numId="11">
     <w:abstractNumId w:val="9"/>
   </w:num>
-  <w:num w:numId="12" w16cid:durableId="1004893672">
+  <w:num w:numId="12">
     <w:abstractNumId w:val="1"/>
   </w:num>
-  <w:num w:numId="13" w16cid:durableId="1875801757">
+  <w:num w:numId="13">
     <w:abstractNumId w:val="10"/>
   </w:num>
-  <w:num w:numId="14" w16cid:durableId="1979530301">
+  <w:num w:numId="14">
     <w:abstractNumId w:val="4"/>
   </w:num>
-  <w:num w:numId="15" w16cid:durableId="1048602531">
+  <w:num w:numId="15">
     <w:abstractNumId w:val="0"/>
   </w:num>
 </w:numbering>
 </file>
 
 <file path=word/styles.xml><?xml version="1.0" encoding="utf-8"?>
-<w:styles xmlns:mc="http://schemas.openxmlformats.org/markup-compatibility/2006" xmlns:r="http://schemas.openxmlformats.org/officeDocument/2006/relationships" xmlns:w="http://schemas.openxmlformats.org/wordprocessingml/2006/main" xmlns:w14="http://schemas.microsoft.com/office/word/2010/wordml" xmlns:w15="http://schemas.microsoft.com/office/word/2012/wordml" xmlns:w16cex="http://schemas.microsoft.com/office/word/2018/wordml/cex" xmlns:w16cid="http://schemas.microsoft.com/office/word/2016/wordml/cid" xmlns:w16="http://schemas.microsoft.com/office/word/2018/wordml" xmlns:w16du="http://schemas.microsoft.com/office/word/2023/wordml/word16du" xmlns:w16sdtdh="http://schemas.microsoft.com/office/word/2020/wordml/sdtdatahash" xmlns:w16sdtfl="http://schemas.microsoft.com/office/word/2024/wordml/sdtformatlock" xmlns:w16se="http://schemas.microsoft.com/office/word/2015/wordml/symex" mc:Ignorable="w14 w15 w16se w16cid w16 w16cex w16sdtdh w16sdtfl w16du">
+<w:styles xmlns:mc="http://schemas.openxmlformats.org/markup-compatibility/2006" xmlns:r="http://schemas.openxmlformats.org/officeDocument/2006/relationships" xmlns:w="http://schemas.openxmlformats.org/wordprocessingml/2006/main" xmlns:w14="http://schemas.microsoft.com/office/word/2010/wordml" xmlns:w15="http://schemas.microsoft.com/office/word/2012/wordml" xmlns:w16cex="http://schemas.microsoft.com/office/word/2018/wordml/cex" xmlns:w16cid="http://schemas.microsoft.com/office/word/2016/wordml/cid" xmlns:w16="http://schemas.microsoft.com/office/word/2018/wordml" xmlns:w16sdtdh="http://schemas.microsoft.com/office/word/2020/wordml/sdtdatahash" xmlns:w16se="http://schemas.microsoft.com/office/word/2015/wordml/symex" mc:Ignorable="w14 w15 w16se w16cid w16 w16cex w16sdtdh">
   <w:docDefaults>
     <w:rPrDefault>
       <w:rPr>
@@ -7035,6 +7288,7 @@
   <w:style w:type="character" w:default="1" w:styleId="DefaultParagraphFont">
     <w:name w:val="Default Paragraph Font"/>
     <w:uiPriority w:val="1"/>
+    <w:semiHidden/>
     <w:unhideWhenUsed/>
   </w:style>
   <w:style w:type="table" w:default="1" w:styleId="TableNormal">

</xml_diff>

<commit_message>
minor cleanup and documentation
</commit_message>
<xml_diff>
--- a/תיעוד של האתר.docx
+++ b/תיעוד של האתר.docx
@@ -167,10 +167,117 @@
     </w:p>
     <w:p>
       <w:pPr>
+        <w:pStyle w:val="NormalWeb"/>
+        <w:bidi/>
+        <w:spacing w:before="0" w:beforeAutospacing="0" w:after="320" w:afterAutospacing="0"/>
+      </w:pPr>
+      <w:r>
+        <w:rPr>
+          <w:rFonts w:ascii="Arial" w:hAnsi="Arial" w:cs="Arial"/>
+          <w:color w:val="666666"/>
+          <w:sz w:val="38"/>
+          <w:szCs w:val="38"/>
+          <w:rtl/>
+        </w:rPr>
+        <w:t>ליבי זולטן 213030885</w:t>
+      </w:r>
+    </w:p>
+    <w:p>
+      <w:pPr>
+        <w:pStyle w:val="NormalWeb"/>
+        <w:bidi/>
+        <w:spacing w:before="0" w:beforeAutospacing="0" w:after="320" w:afterAutospacing="0"/>
+        <w:rPr>
+          <w:rtl/>
+        </w:rPr>
+      </w:pPr>
+      <w:r>
+        <w:rPr>
+          <w:rFonts w:ascii="Arial" w:hAnsi="Arial" w:cs="Arial"/>
+          <w:color w:val="666666"/>
+          <w:sz w:val="38"/>
+          <w:szCs w:val="38"/>
+          <w:rtl/>
+        </w:rPr>
+        <w:t>יונתן מולר 322294877</w:t>
+      </w:r>
+    </w:p>
+    <w:p>
+      <w:pPr>
+        <w:pStyle w:val="NormalWeb"/>
+        <w:bidi/>
+        <w:spacing w:before="0" w:beforeAutospacing="0" w:after="320" w:afterAutospacing="0"/>
+        <w:rPr>
+          <w:rtl/>
+        </w:rPr>
+      </w:pPr>
+      <w:r>
+        <w:rPr>
+          <w:rFonts w:ascii="Arial" w:hAnsi="Arial" w:cs="Arial"/>
+          <w:color w:val="666666"/>
+          <w:sz w:val="38"/>
+          <w:szCs w:val="38"/>
+          <w:rtl/>
+        </w:rPr>
+        <w:t>עדן פוליאצקי 325755213</w:t>
+      </w:r>
+    </w:p>
+    <w:p>
+      <w:pPr>
+        <w:pStyle w:val="NormalWeb"/>
+        <w:bidi/>
+        <w:spacing w:before="0" w:beforeAutospacing="0" w:after="320" w:afterAutospacing="0"/>
+        <w:rPr>
+          <w:rtl/>
+        </w:rPr>
+      </w:pPr>
+      <w:r>
+        <w:rPr>
+          <w:rFonts w:ascii="Arial" w:hAnsi="Arial" w:cs="Arial"/>
+          <w:color w:val="666666"/>
+          <w:sz w:val="38"/>
+          <w:szCs w:val="38"/>
+          <w:rtl/>
+        </w:rPr>
+        <w:t>ניר דוד 201283777</w:t>
+      </w:r>
+    </w:p>
+    <w:p>
+      <w:pPr>
+        <w:bidi/>
+        <w:rPr>
+          <w:rtl/>
+        </w:rPr>
+      </w:pPr>
+    </w:p>
+    <w:p>
+      <w:pPr>
+        <w:bidi/>
+        <w:rPr>
+          <w:rtl/>
+        </w:rPr>
+      </w:pPr>
+    </w:p>
+    <w:p>
+      <w:pPr>
+        <w:rPr>
+          <w:rtl/>
+        </w:rPr>
+      </w:pPr>
+      <w:r>
+        <w:rPr>
+          <w:rtl/>
+        </w:rPr>
+        <w:br w:type="page"/>
+      </w:r>
+    </w:p>
+    <w:p>
+      <w:pPr>
         <w:bidi/>
         <w:rPr>
           <w:sz w:val="44"/>
           <w:szCs w:val="44"/>
+          <w:u w:val="single"/>
           <w:rtl/>
         </w:rPr>
       </w:pPr>
@@ -179,473 +286,581 @@
           <w:rFonts w:hint="cs"/>
           <w:sz w:val="44"/>
           <w:szCs w:val="44"/>
-          <w:rtl/>
-        </w:rPr>
-        <w:t>ליבי זולטן 213030885</w:t>
-      </w:r>
-    </w:p>
-    <w:p>
-      <w:pPr>
-        <w:bidi/>
-        <w:rPr>
+          <w:u w:val="single"/>
+          <w:rtl/>
+        </w:rPr>
+        <w:lastRenderedPageBreak/>
+        <w:t>מבוא</w:t>
+      </w:r>
+    </w:p>
+    <w:p>
+      <w:pPr>
+        <w:bidi/>
+        <w:rPr>
+          <w:rtl/>
+        </w:rPr>
+      </w:pPr>
+      <w:r>
+        <w:rPr>
+          <w:rFonts w:hint="cs"/>
+          <w:rtl/>
+        </w:rPr>
+        <w:t xml:space="preserve">כל קבצי האתר כלולים תחת התיקייה </w:t>
+      </w:r>
+      <w:r>
+        <w:t>src</w:t>
+      </w:r>
+      <w:r>
+        <w:rPr>
+          <w:rFonts w:hint="cs"/>
+          <w:rtl/>
+        </w:rPr>
+        <w:t>:</w:t>
+      </w:r>
+    </w:p>
+    <w:p>
+      <w:pPr>
+        <w:pStyle w:val="ListParagraph"/>
+        <w:numPr>
+          <w:ilvl w:val="0"/>
+          <w:numId w:val="16"/>
+        </w:numPr>
+        <w:bidi/>
+      </w:pPr>
+      <w:r>
+        <w:rPr>
+          <w:rFonts w:hint="cs"/>
+          <w:rtl/>
+        </w:rPr>
+        <w:t xml:space="preserve">תיקיית </w:t>
+      </w:r>
+      <w:r>
+        <w:t>pages</w:t>
+      </w:r>
+      <w:r>
+        <w:rPr>
+          <w:rFonts w:hint="cs"/>
+          <w:rtl/>
+        </w:rPr>
+        <w:t>: כל קבצי ה</w:t>
+      </w:r>
+      <w:r>
+        <w:t>html</w:t>
+      </w:r>
+      <w:r>
+        <w:rPr>
+          <w:rFonts w:hint="cs"/>
+          <w:rtl/>
+        </w:rPr>
+        <w:t>.</w:t>
+      </w:r>
+    </w:p>
+    <w:p>
+      <w:pPr>
+        <w:pStyle w:val="ListParagraph"/>
+        <w:numPr>
+          <w:ilvl w:val="0"/>
+          <w:numId w:val="16"/>
+        </w:numPr>
+        <w:bidi/>
+        <w:rPr>
+          <w:rtl/>
+        </w:rPr>
+      </w:pPr>
+      <w:r>
+        <w:rPr>
+          <w:rFonts w:hint="cs"/>
+          <w:rtl/>
+        </w:rPr>
+        <w:t xml:space="preserve">תיקיית </w:t>
+      </w:r>
+      <w:r>
+        <w:t>styles</w:t>
+      </w:r>
+      <w:r>
+        <w:rPr>
+          <w:rFonts w:hint="cs"/>
+          <w:rtl/>
+        </w:rPr>
+        <w:t>: מכיל את קובץ ה</w:t>
+      </w:r>
+      <w:r>
+        <w:t>css</w:t>
+      </w:r>
+      <w:r>
+        <w:rPr>
+          <w:rFonts w:hint="cs"/>
+          <w:rtl/>
+        </w:rPr>
+        <w:t xml:space="preserve"> של האתר </w:t>
+      </w:r>
+      <w:r>
+        <w:t>Style.css</w:t>
+      </w:r>
+      <w:r>
+        <w:rPr>
+          <w:rFonts w:hint="cs"/>
+          <w:rtl/>
+        </w:rPr>
+        <w:t>.</w:t>
+      </w:r>
+    </w:p>
+    <w:p>
+      <w:pPr>
+        <w:pStyle w:val="ListParagraph"/>
+        <w:numPr>
+          <w:ilvl w:val="0"/>
+          <w:numId w:val="16"/>
+        </w:numPr>
+        <w:bidi/>
+        <w:rPr>
+          <w:rtl/>
+        </w:rPr>
+      </w:pPr>
+      <w:r>
+        <w:rPr>
+          <w:rFonts w:hint="cs"/>
+          <w:rtl/>
+        </w:rPr>
+        <w:t xml:space="preserve">תיקיית </w:t>
+      </w:r>
+      <w:r>
+        <w:t>assets</w:t>
+      </w:r>
+      <w:r>
+        <w:rPr>
+          <w:rFonts w:hint="cs"/>
+          <w:rtl/>
+        </w:rPr>
+        <w:t>: מכיל תמונות</w:t>
+      </w:r>
+      <w:r>
+        <w:rPr>
+          <w:rFonts w:hint="cs"/>
+          <w:rtl/>
+        </w:rPr>
+        <w:t xml:space="preserve"> של האתר</w:t>
+      </w:r>
+      <w:r>
+        <w:rPr>
+          <w:rFonts w:hint="cs"/>
+          <w:rtl/>
+        </w:rPr>
+        <w:t>.</w:t>
+      </w:r>
+    </w:p>
+    <w:p>
+      <w:pPr>
+        <w:pStyle w:val="ListParagraph"/>
+        <w:numPr>
+          <w:ilvl w:val="0"/>
+          <w:numId w:val="16"/>
+        </w:numPr>
+        <w:bidi/>
+        <w:rPr>
+          <w:rtl/>
+        </w:rPr>
+      </w:pPr>
+      <w:r>
+        <w:rPr>
+          <w:rFonts w:hint="cs"/>
+          <w:rtl/>
+        </w:rPr>
+        <w:t xml:space="preserve">תיקיית </w:t>
+      </w:r>
+      <w:r>
+        <w:t>javascript</w:t>
+      </w:r>
+      <w:r>
+        <w:rPr>
+          <w:rFonts w:hint="cs"/>
+          <w:rtl/>
+        </w:rPr>
+        <w:t>:</w:t>
+      </w:r>
+      <w:r>
+        <w:rPr>
+          <w:rFonts w:hint="cs"/>
+        </w:rPr>
+        <w:t xml:space="preserve"> </w:t>
+      </w:r>
+      <w:r>
+        <w:rPr>
+          <w:rFonts w:hint="cs"/>
+          <w:rtl/>
+        </w:rPr>
+        <w:t xml:space="preserve">מכיל קבצי </w:t>
+      </w:r>
+      <w:r>
+        <w:t>javascript</w:t>
+      </w:r>
+      <w:r>
+        <w:rPr>
+          <w:rFonts w:hint="cs"/>
+          <w:rtl/>
+        </w:rPr>
+        <w:t xml:space="preserve"> שנקראים ממקומות שונים באתר.</w:t>
+      </w:r>
+    </w:p>
+    <w:p>
+      <w:pPr>
+        <w:bidi/>
+        <w:rPr>
+          <w:rFonts w:hint="cs"/>
+          <w:rtl/>
+        </w:rPr>
+      </w:pPr>
+    </w:p>
+    <w:p>
+      <w:pPr>
+        <w:bidi/>
+        <w:rPr>
+          <w:rtl/>
+        </w:rPr>
+      </w:pPr>
+      <w:r>
+        <w:rPr>
+          <w:rFonts w:hint="cs"/>
+          <w:rtl/>
+        </w:rPr>
+        <w:t>לכל עמוד באתר יש סרגל ניווט בחלק העליון ו-</w:t>
+      </w:r>
+      <w:r>
+        <w:t xml:space="preserve">footer </w:t>
+      </w:r>
+      <w:r>
+        <w:rPr>
+          <w:rFonts w:hint="cs"/>
+          <w:rtl/>
+        </w:rPr>
+        <w:t xml:space="preserve"> בחלק התחתון. הכנסנו אותם עם </w:t>
+      </w:r>
+      <w:r>
+        <w:t>javascript</w:t>
+      </w:r>
+      <w:r>
+        <w:rPr>
+          <w:rFonts w:hint="cs"/>
+          <w:rtl/>
+        </w:rPr>
+        <w:t xml:space="preserve"> כדי לחסוך שינויים בדפים שונים.</w:t>
+      </w:r>
+    </w:p>
+    <w:p>
+      <w:pPr>
+        <w:bidi/>
+        <w:rPr>
+          <w:rFonts w:hint="cs"/>
           <w:sz w:val="44"/>
           <w:szCs w:val="44"/>
-          <w:rtl/>
-        </w:rPr>
-      </w:pPr>
-      <w:r>
-        <w:rPr>
-          <w:rFonts w:hint="cs"/>
+          <w:u w:val="single"/>
+          <w:rtl/>
+        </w:rPr>
+      </w:pPr>
+      <w:r>
+        <w:rPr>
+          <w:noProof/>
+        </w:rPr>
+        <w:drawing>
+          <wp:inline distT="0" distB="0" distL="0" distR="0" wp14:anchorId="08F35B98" wp14:editId="42FCB41A">
+            <wp:extent cx="5486400" cy="268605"/>
+            <wp:effectExtent l="0" t="0" r="0" b="0"/>
+            <wp:docPr id="1" name="Picture 1"/>
+            <wp:cNvGraphicFramePr>
+              <a:graphicFrameLocks xmlns:a="http://schemas.openxmlformats.org/drawingml/2006/main" noChangeAspect="1"/>
+            </wp:cNvGraphicFramePr>
+            <a:graphic xmlns:a="http://schemas.openxmlformats.org/drawingml/2006/main">
+              <a:graphicData uri="http://schemas.openxmlformats.org/drawingml/2006/picture">
+                <pic:pic xmlns:pic="http://schemas.openxmlformats.org/drawingml/2006/picture">
+                  <pic:nvPicPr>
+                    <pic:cNvPr id="0" name="Picture 1"/>
+                    <pic:cNvPicPr>
+                      <a:picLocks noChangeAspect="1" noChangeArrowheads="1"/>
+                    </pic:cNvPicPr>
+                  </pic:nvPicPr>
+                  <pic:blipFill>
+                    <a:blip r:embed="rId8" cstate="print">
+                      <a:extLst>
+                        <a:ext uri="{28A0092B-C50C-407E-A947-70E740481C1C}">
+                          <a14:useLocalDpi xmlns:a14="http://schemas.microsoft.com/office/drawing/2010/main" val="0"/>
+                        </a:ext>
+                      </a:extLst>
+                    </a:blip>
+                    <a:srcRect/>
+                    <a:stretch>
+                      <a:fillRect/>
+                    </a:stretch>
+                  </pic:blipFill>
+                  <pic:spPr bwMode="auto">
+                    <a:xfrm>
+                      <a:off x="0" y="0"/>
+                      <a:ext cx="5486400" cy="268605"/>
+                    </a:xfrm>
+                    <a:prstGeom prst="rect">
+                      <a:avLst/>
+                    </a:prstGeom>
+                    <a:noFill/>
+                    <a:ln>
+                      <a:noFill/>
+                    </a:ln>
+                  </pic:spPr>
+                </pic:pic>
+              </a:graphicData>
+            </a:graphic>
+          </wp:inline>
+        </w:drawing>
+      </w:r>
+    </w:p>
+    <w:p>
+      <w:pPr>
+        <w:bidi/>
+        <w:rPr>
           <w:sz w:val="44"/>
           <w:szCs w:val="44"/>
-          <w:rtl/>
-        </w:rPr>
-        <w:t xml:space="preserve">עדן פוליאצקי </w:t>
-      </w:r>
-    </w:p>
-    <w:p>
-      <w:pPr>
-        <w:bidi/>
-        <w:rPr>
+          <w:u w:val="single"/>
+          <w:rtl/>
+        </w:rPr>
+      </w:pPr>
+      <w:r>
+        <w:rPr>
+          <w:noProof/>
+        </w:rPr>
+        <w:drawing>
+          <wp:inline distT="0" distB="0" distL="0" distR="0" wp14:anchorId="7B22B4DF" wp14:editId="23B021F7">
+            <wp:extent cx="5486400" cy="918210"/>
+            <wp:effectExtent l="0" t="0" r="0" b="0"/>
+            <wp:docPr id="2" name="Picture 2"/>
+            <wp:cNvGraphicFramePr>
+              <a:graphicFrameLocks xmlns:a="http://schemas.openxmlformats.org/drawingml/2006/main" noChangeAspect="1"/>
+            </wp:cNvGraphicFramePr>
+            <a:graphic xmlns:a="http://schemas.openxmlformats.org/drawingml/2006/main">
+              <a:graphicData uri="http://schemas.openxmlformats.org/drawingml/2006/picture">
+                <pic:pic xmlns:pic="http://schemas.openxmlformats.org/drawingml/2006/picture">
+                  <pic:nvPicPr>
+                    <pic:cNvPr id="0" name="Picture 3"/>
+                    <pic:cNvPicPr>
+                      <a:picLocks noChangeAspect="1" noChangeArrowheads="1"/>
+                    </pic:cNvPicPr>
+                  </pic:nvPicPr>
+                  <pic:blipFill>
+                    <a:blip r:embed="rId9" cstate="print">
+                      <a:extLst>
+                        <a:ext uri="{28A0092B-C50C-407E-A947-70E740481C1C}">
+                          <a14:useLocalDpi xmlns:a14="http://schemas.microsoft.com/office/drawing/2010/main" val="0"/>
+                        </a:ext>
+                      </a:extLst>
+                    </a:blip>
+                    <a:srcRect/>
+                    <a:stretch>
+                      <a:fillRect/>
+                    </a:stretch>
+                  </pic:blipFill>
+                  <pic:spPr bwMode="auto">
+                    <a:xfrm>
+                      <a:off x="0" y="0"/>
+                      <a:ext cx="5486400" cy="918210"/>
+                    </a:xfrm>
+                    <a:prstGeom prst="rect">
+                      <a:avLst/>
+                    </a:prstGeom>
+                    <a:noFill/>
+                    <a:ln>
+                      <a:noFill/>
+                    </a:ln>
+                  </pic:spPr>
+                </pic:pic>
+              </a:graphicData>
+            </a:graphic>
+          </wp:inline>
+        </w:drawing>
+      </w:r>
+    </w:p>
+    <w:p>
+      <w:pPr>
+        <w:bidi/>
+        <w:rPr>
+          <w:rtl/>
+        </w:rPr>
+      </w:pPr>
+      <w:r>
+        <w:rPr>
+          <w:rFonts w:hint="cs"/>
+          <w:rtl/>
+        </w:rPr>
+        <w:t xml:space="preserve">הם נתענים על ידי </w:t>
+      </w:r>
+      <w:r>
+        <w:t>templateLoad.js</w:t>
+      </w:r>
+      <w:r>
+        <w:rPr>
+          <w:rFonts w:hint="cs"/>
+          <w:rtl/>
+        </w:rPr>
+        <w:t xml:space="preserve"> שפשוט מדביק תוכן </w:t>
+      </w:r>
+      <w:r>
+        <w:t>html</w:t>
+      </w:r>
+      <w:r>
+        <w:rPr>
+          <w:rFonts w:hint="cs"/>
+          <w:rtl/>
+        </w:rPr>
+        <w:t xml:space="preserve"> בתחילה והסוף של העמוד ממנו הוא נקרא.</w:t>
+      </w:r>
+    </w:p>
+    <w:p>
+      <w:pPr>
+        <w:bidi/>
+        <w:rPr>
+          <w:rtl/>
+        </w:rPr>
+      </w:pPr>
+    </w:p>
+    <w:p>
+      <w:pPr>
+        <w:bidi/>
+        <w:rPr>
+          <w:rtl/>
+        </w:rPr>
+      </w:pPr>
+    </w:p>
+    <w:p>
+      <w:pPr>
+        <w:bidi/>
+        <w:rPr>
+          <w:rtl/>
+        </w:rPr>
+      </w:pPr>
+    </w:p>
+    <w:p>
+      <w:pPr>
+        <w:bidi/>
+        <w:rPr>
+          <w:rtl/>
+        </w:rPr>
+      </w:pPr>
+    </w:p>
+    <w:p>
+      <w:pPr>
+        <w:bidi/>
+        <w:rPr>
+          <w:rtl/>
+        </w:rPr>
+      </w:pPr>
+    </w:p>
+    <w:p>
+      <w:pPr>
+        <w:bidi/>
+        <w:rPr>
+          <w:rtl/>
+        </w:rPr>
+      </w:pPr>
+    </w:p>
+    <w:p>
+      <w:pPr>
+        <w:bidi/>
+        <w:rPr>
+          <w:rtl/>
+        </w:rPr>
+      </w:pPr>
+    </w:p>
+    <w:p>
+      <w:pPr>
+        <w:bidi/>
+        <w:rPr>
+          <w:rtl/>
+        </w:rPr>
+      </w:pPr>
+    </w:p>
+    <w:p>
+      <w:pPr>
+        <w:bidi/>
+        <w:rPr>
+          <w:rtl/>
+        </w:rPr>
+      </w:pPr>
+    </w:p>
+    <w:p>
+      <w:pPr>
+        <w:bidi/>
+        <w:rPr>
+          <w:rtl/>
+        </w:rPr>
+      </w:pPr>
+    </w:p>
+    <w:p>
+      <w:pPr>
+        <w:bidi/>
+        <w:rPr>
+          <w:rFonts w:hint="cs"/>
           <w:sz w:val="44"/>
           <w:szCs w:val="44"/>
-          <w:rtl/>
-        </w:rPr>
-      </w:pPr>
-      <w:r>
-        <w:rPr>
-          <w:rFonts w:hint="cs"/>
+          <w:u w:val="single"/>
+          <w:rtl/>
+        </w:rPr>
+      </w:pPr>
+    </w:p>
+    <w:p>
+      <w:pPr>
+        <w:bidi/>
+        <w:rPr>
           <w:sz w:val="44"/>
           <w:szCs w:val="44"/>
-          <w:rtl/>
-        </w:rPr>
-        <w:t xml:space="preserve">יונתן מולר </w:t>
-      </w:r>
+          <w:u w:val="single"/>
+          <w:rtl/>
+        </w:rPr>
+      </w:pPr>
       <w:r>
         <w:rPr>
           <w:rFonts w:hint="cs"/>
           <w:sz w:val="44"/>
           <w:szCs w:val="44"/>
-          <w:rtl/>
-        </w:rPr>
-        <w:t>322294877</w:t>
-      </w:r>
-    </w:p>
-    <w:p>
-      <w:pPr>
-        <w:bidi/>
-        <w:rPr>
+          <w:u w:val="single"/>
+          <w:rtl/>
+        </w:rPr>
+        <w:lastRenderedPageBreak/>
+        <w:t xml:space="preserve">עמוד </w:t>
+      </w:r>
+      <w:r>
+        <w:rPr>
+          <w:rFonts w:hint="cs"/>
           <w:sz w:val="44"/>
           <w:szCs w:val="44"/>
-          <w:rtl/>
-        </w:rPr>
-      </w:pPr>
+          <w:u w:val="single"/>
+          <w:rtl/>
+        </w:rPr>
+        <w:t>כניסת</w:t>
+      </w:r>
       <w:r>
         <w:rPr>
           <w:rFonts w:hint="cs"/>
           <w:sz w:val="44"/>
           <w:szCs w:val="44"/>
-          <w:rtl/>
-        </w:rPr>
-        <w:t>ניר דוד</w:t>
+          <w:u w:val="single"/>
+          <w:rtl/>
+        </w:rPr>
+        <w:t xml:space="preserve"> משתמש</w:t>
       </w:r>
       <w:r>
         <w:rPr>
           <w:rFonts w:hint="cs"/>
           <w:sz w:val="44"/>
           <w:szCs w:val="44"/>
-          <w:rtl/>
-        </w:rPr>
-        <w:t xml:space="preserve"> </w:t>
-      </w:r>
-    </w:p>
-    <w:p>
-      <w:pPr>
-        <w:bidi/>
-        <w:rPr>
-          <w:rtl/>
-        </w:rPr>
-      </w:pPr>
-    </w:p>
-    <w:p>
-      <w:pPr>
-        <w:bidi/>
-        <w:rPr>
-          <w:rtl/>
-        </w:rPr>
-      </w:pPr>
-    </w:p>
-    <w:p>
-      <w:pPr>
-        <w:rPr>
-          <w:rtl/>
-        </w:rPr>
-      </w:pPr>
-      <w:r>
-        <w:rPr>
-          <w:rtl/>
-        </w:rPr>
-        <w:br w:type="page"/>
-      </w:r>
-    </w:p>
-    <w:p>
-      <w:pPr>
-        <w:bidi/>
+          <w:u w:val="single"/>
+          <w:rtl/>
+        </w:rPr>
+        <w:t xml:space="preserve"> - </w:t>
+      </w:r>
+      <w:r>
         <w:rPr>
           <w:sz w:val="44"/>
           <w:szCs w:val="44"/>
           <w:u w:val="single"/>
-          <w:rtl/>
-        </w:rPr>
-      </w:pPr>
-      <w:r>
-        <w:rPr>
-          <w:rFonts w:hint="cs"/>
-          <w:sz w:val="44"/>
-          <w:szCs w:val="44"/>
-          <w:u w:val="single"/>
-          <w:rtl/>
-        </w:rPr>
-        <w:lastRenderedPageBreak/>
-        <w:t>תוכן עניינים</w:t>
-      </w:r>
-      <w:r>
-        <w:rPr>
-          <w:rFonts w:hint="cs"/>
-          <w:sz w:val="44"/>
-          <w:szCs w:val="44"/>
-          <w:u w:val="single"/>
-          <w:rtl/>
-        </w:rPr>
-        <w:t>:</w:t>
-      </w:r>
-    </w:p>
-    <w:p>
-      <w:pPr>
-        <w:bidi/>
-        <w:rPr>
-          <w:rtl/>
-        </w:rPr>
-      </w:pPr>
-    </w:p>
-    <w:p>
-      <w:pPr>
-        <w:bidi/>
-        <w:rPr>
-          <w:sz w:val="28"/>
-          <w:szCs w:val="28"/>
-          <w:rtl/>
-        </w:rPr>
-      </w:pPr>
-      <w:r>
-        <w:rPr>
-          <w:rFonts w:hint="cs"/>
-          <w:sz w:val="28"/>
-          <w:szCs w:val="28"/>
-          <w:rtl/>
-        </w:rPr>
-        <w:t xml:space="preserve">עמוד התחברות לאזור האישי של המשתמש..........................................עמ' </w:t>
-      </w:r>
-    </w:p>
-    <w:p>
-      <w:pPr>
-        <w:bidi/>
-        <w:rPr>
-          <w:sz w:val="28"/>
-          <w:szCs w:val="28"/>
-          <w:rtl/>
-        </w:rPr>
-      </w:pPr>
-      <w:r>
-        <w:rPr>
-          <w:rFonts w:hint="cs"/>
-          <w:sz w:val="28"/>
-          <w:szCs w:val="28"/>
-          <w:rtl/>
-        </w:rPr>
-        <w:t>עמוד יצירת משתמש חדש..........................................עמ'</w:t>
-      </w:r>
-    </w:p>
-    <w:p>
-      <w:pPr>
-        <w:bidi/>
-        <w:rPr>
-          <w:sz w:val="28"/>
-          <w:szCs w:val="28"/>
-          <w:rtl/>
-        </w:rPr>
-      </w:pPr>
-      <w:r>
-        <w:rPr>
-          <w:rFonts w:hint="cs"/>
-          <w:sz w:val="28"/>
-          <w:szCs w:val="28"/>
-          <w:rtl/>
-        </w:rPr>
-        <w:t>עמוד</w:t>
-      </w:r>
-      <w:r>
-        <w:rPr>
-          <w:sz w:val="28"/>
-          <w:szCs w:val="28"/>
-        </w:rPr>
-        <w:t xml:space="preserve"> </w:t>
-      </w:r>
-      <w:r>
-        <w:rPr>
-          <w:rFonts w:hint="cs"/>
-          <w:sz w:val="28"/>
-          <w:szCs w:val="28"/>
-          <w:rtl/>
-        </w:rPr>
-        <w:t xml:space="preserve"> איפוס פרטי התחברות..........................................עמ'</w:t>
-      </w:r>
-    </w:p>
-    <w:p>
-      <w:pPr>
-        <w:bidi/>
-        <w:rPr>
-          <w:sz w:val="28"/>
-          <w:szCs w:val="28"/>
-          <w:rtl/>
-        </w:rPr>
-      </w:pPr>
-      <w:r>
-        <w:rPr>
-          <w:rFonts w:hint="cs"/>
-          <w:sz w:val="28"/>
-          <w:szCs w:val="28"/>
-          <w:rtl/>
-        </w:rPr>
-        <w:t>עמוד הבית</w:t>
-      </w:r>
-      <w:r>
-        <w:rPr>
-          <w:rFonts w:hint="cs"/>
-          <w:sz w:val="28"/>
-          <w:szCs w:val="28"/>
-          <w:rtl/>
-        </w:rPr>
-        <w:t>..........................................עמ'</w:t>
-      </w:r>
-    </w:p>
-    <w:p>
-      <w:pPr>
-        <w:bidi/>
-        <w:rPr>
-          <w:sz w:val="28"/>
-          <w:szCs w:val="28"/>
-          <w:rtl/>
-        </w:rPr>
-      </w:pPr>
-      <w:r>
-        <w:rPr>
-          <w:rFonts w:hint="cs"/>
-          <w:sz w:val="28"/>
-          <w:szCs w:val="28"/>
-          <w:rtl/>
-        </w:rPr>
-        <w:t>עמוד הרשמה למנוי פרימיום</w:t>
-      </w:r>
-      <w:r>
-        <w:rPr>
-          <w:rFonts w:hint="cs"/>
-          <w:sz w:val="28"/>
-          <w:szCs w:val="28"/>
-          <w:rtl/>
-        </w:rPr>
-        <w:t>..........................................עמ'</w:t>
-      </w:r>
-    </w:p>
-    <w:p>
-      <w:pPr>
-        <w:bidi/>
-        <w:rPr>
-          <w:sz w:val="28"/>
-          <w:szCs w:val="28"/>
-          <w:rtl/>
-        </w:rPr>
-      </w:pPr>
-      <w:r>
-        <w:rPr>
-          <w:rFonts w:hint="cs"/>
-          <w:sz w:val="28"/>
-          <w:szCs w:val="28"/>
-          <w:rtl/>
-        </w:rPr>
-        <w:t>עמוד תשלום למנוי פרימיום</w:t>
-      </w:r>
-      <w:r>
-        <w:rPr>
-          <w:rFonts w:hint="cs"/>
-          <w:sz w:val="28"/>
-          <w:szCs w:val="28"/>
-          <w:rtl/>
-        </w:rPr>
-        <w:t>..........................................עמ'</w:t>
-      </w:r>
-    </w:p>
-    <w:p>
-      <w:pPr>
-        <w:bidi/>
-        <w:rPr>
-          <w:sz w:val="28"/>
-          <w:szCs w:val="28"/>
-        </w:rPr>
-      </w:pPr>
-      <w:r>
-        <w:rPr>
-          <w:rFonts w:hint="cs"/>
-          <w:sz w:val="28"/>
-          <w:szCs w:val="28"/>
-          <w:rtl/>
-        </w:rPr>
-        <w:t>עמוד צור קשר</w:t>
-      </w:r>
-      <w:r>
-        <w:rPr>
-          <w:rFonts w:hint="cs"/>
-          <w:sz w:val="28"/>
-          <w:szCs w:val="28"/>
-          <w:rtl/>
-        </w:rPr>
-        <w:t>..........................................עמ'</w:t>
-      </w:r>
-    </w:p>
-    <w:p>
-      <w:pPr>
-        <w:bidi/>
-        <w:rPr>
-          <w:sz w:val="28"/>
-          <w:szCs w:val="28"/>
-          <w:rtl/>
-        </w:rPr>
-      </w:pPr>
-      <w:r>
-        <w:rPr>
-          <w:sz w:val="28"/>
-          <w:szCs w:val="28"/>
-        </w:rPr>
-        <w:t>Javascript</w:t>
-      </w:r>
-      <w:r>
-        <w:rPr>
-          <w:rFonts w:hint="cs"/>
-          <w:sz w:val="28"/>
-          <w:szCs w:val="28"/>
-          <w:rtl/>
-        </w:rPr>
-        <w:t>........................................עמ</w:t>
-      </w:r>
-      <w:r>
-        <w:rPr>
-          <w:rFonts w:hint="cs"/>
-          <w:sz w:val="28"/>
-          <w:szCs w:val="28"/>
-          <w:rtl/>
-        </w:rPr>
-        <w:t>'</w:t>
-      </w:r>
-    </w:p>
-    <w:p>
-      <w:pPr>
-        <w:bidi/>
-        <w:rPr>
-          <w:sz w:val="28"/>
-          <w:szCs w:val="28"/>
-          <w:rtl/>
-        </w:rPr>
-      </w:pPr>
-    </w:p>
-    <w:p>
-      <w:pPr>
-        <w:bidi/>
-        <w:rPr>
-          <w:rtl/>
-        </w:rPr>
-      </w:pPr>
-    </w:p>
-    <w:p>
-      <w:pPr>
-        <w:bidi/>
-        <w:rPr>
-          <w:rtl/>
-        </w:rPr>
-      </w:pPr>
-    </w:p>
-    <w:p>
-      <w:pPr>
-        <w:bidi/>
-      </w:pPr>
-    </w:p>
-    <w:p>
-      <w:pPr>
-        <w:bidi/>
-        <w:rPr>
-          <w:rtl/>
-        </w:rPr>
-      </w:pPr>
-    </w:p>
-    <w:p>
-      <w:pPr>
-        <w:rPr>
-          <w:rtl/>
-        </w:rPr>
-      </w:pPr>
-      <w:r>
-        <w:rPr>
-          <w:rtl/>
-        </w:rPr>
-        <w:br w:type="page"/>
-      </w:r>
-    </w:p>
-    <w:p>
-      <w:pPr>
-        <w:bidi/>
-        <w:rPr>
-          <w:sz w:val="44"/>
-          <w:szCs w:val="44"/>
-          <w:u w:val="single"/>
-          <w:rtl/>
-        </w:rPr>
-      </w:pPr>
-      <w:r>
-        <w:rPr>
-          <w:rFonts w:hint="cs"/>
-          <w:sz w:val="44"/>
-          <w:szCs w:val="44"/>
-          <w:u w:val="single"/>
-          <w:rtl/>
-        </w:rPr>
-        <w:lastRenderedPageBreak/>
-        <w:t xml:space="preserve">עמוד </w:t>
-      </w:r>
-      <w:r>
-        <w:rPr>
-          <w:rFonts w:hint="cs"/>
-          <w:sz w:val="44"/>
-          <w:szCs w:val="44"/>
-          <w:u w:val="single"/>
-          <w:rtl/>
-        </w:rPr>
-        <w:t>יצירת משתמש חדש</w:t>
-      </w:r>
-    </w:p>
-    <w:p>
-      <w:pPr>
-        <w:bidi/>
-        <w:rPr>
-          <w:rtl/>
-        </w:rPr>
-      </w:pPr>
-    </w:p>
-    <w:p>
-      <w:pPr>
-        <w:bidi/>
-        <w:rPr>
-          <w:rtl/>
-        </w:rPr>
-      </w:pPr>
+        </w:rPr>
+        <w:t>Login.html</w:t>
+      </w:r>
     </w:p>
     <w:p>
       <w:pPr>
@@ -715,6 +930,9 @@
     <w:p>
       <w:pPr>
         <w:bidi/>
+        <w:rPr>
+          <w:rtl/>
+        </w:rPr>
       </w:pPr>
       <w:r>
         <w:rPr>
@@ -737,50 +955,6 @@
         </w:rPr>
         <w:t>משתמש חדש עבורו.</w:t>
       </w:r>
-    </w:p>
-    <w:p>
-      <w:pPr>
-        <w:bidi/>
-        <w:rPr>
-          <w:rtl/>
-        </w:rPr>
-      </w:pPr>
-      <w:r>
-        <w:rPr>
-          <w:rFonts w:hint="cs"/>
-          <w:rtl/>
-        </w:rPr>
-        <w:t xml:space="preserve">בנוסף, באמצעות סרגל הניווט שמופיע בראש העמוד, ניתן לעבור בין </w:t>
-      </w:r>
-      <w:r>
-        <w:rPr>
-          <w:rFonts w:hint="cs"/>
-          <w:rtl/>
-        </w:rPr>
-        <w:t>העבומדים הבאים על ידי לחיצה על הטקסט/כפתור מתאים: עמוד הבית, לתכנן</w:t>
-      </w:r>
-      <w:r>
-        <w:rPr>
-          <w:rFonts w:hint="cs"/>
-          <w:rtl/>
-        </w:rPr>
-        <w:t xml:space="preserve"> חופשה (לתכנן), להזמין חופשה או בגדים (להזמין), </w:t>
-      </w:r>
-      <w:r>
-        <w:rPr>
-          <w:rFonts w:hint="cs"/>
-          <w:rtl/>
-        </w:rPr>
-        <w:t>טיסות (טיסה), צור קשר.</w:t>
-      </w:r>
-    </w:p>
-    <w:p>
-      <w:pPr>
-        <w:bidi/>
-        <w:rPr>
-          <w:rtl/>
-        </w:rPr>
-      </w:pPr>
     </w:p>
     <w:p>
       <w:pPr>
@@ -974,7 +1148,14 @@
           <w:rFonts w:hint="cs"/>
           <w:rtl/>
         </w:rPr>
-        <w:t xml:space="preserve">הזמן פרטי התחברות </w:t>
+        <w:t xml:space="preserve">מכניס </w:t>
+      </w:r>
+      <w:r>
+        <w:rPr>
+          <w:rFonts w:hint="cs"/>
+          <w:rtl/>
+        </w:rPr>
+        <w:t xml:space="preserve">פרטי התחברות </w:t>
       </w:r>
       <w:r>
         <w:rPr>
@@ -1232,16 +1413,12 @@
           <w:numId w:val="2"/>
         </w:numPr>
         <w:bidi/>
-        <w:rPr>
-          <w:rtl/>
-        </w:rPr>
-      </w:pPr>
-      <w:r>
-        <w:rPr>
-          <w:rFonts w:hint="cs"/>
-          <w:rtl/>
-        </w:rPr>
-        <w:lastRenderedPageBreak/>
+      </w:pPr>
+      <w:r>
+        <w:rPr>
+          <w:rFonts w:hint="cs"/>
+          <w:rtl/>
+        </w:rPr>
         <w:t>מעבר בין עמודים על ידי קליטת הל</w:t>
       </w:r>
       <w:r>
@@ -1251,6 +1428,38 @@
         </w:rPr>
         <w:t>חיצות של הכפתורים.</w:t>
       </w:r>
+    </w:p>
+    <w:p>
+      <w:pPr>
+        <w:bidi/>
+        <w:rPr>
+          <w:rtl/>
+        </w:rPr>
+      </w:pPr>
+    </w:p>
+    <w:p>
+      <w:pPr>
+        <w:bidi/>
+        <w:rPr>
+          <w:rtl/>
+        </w:rPr>
+      </w:pPr>
+    </w:p>
+    <w:p>
+      <w:pPr>
+        <w:bidi/>
+        <w:rPr>
+          <w:rtl/>
+        </w:rPr>
+      </w:pPr>
+    </w:p>
+    <w:p>
+      <w:pPr>
+        <w:bidi/>
+        <w:rPr>
+          <w:rtl/>
+        </w:rPr>
+      </w:pPr>
     </w:p>
     <w:p>
       <w:pPr>
@@ -1270,6 +1479,7 @@
           <w:u w:val="single"/>
           <w:rtl/>
         </w:rPr>
+        <w:lastRenderedPageBreak/>
         <w:t>עמוד</w:t>
       </w:r>
       <w:r>
@@ -1288,16 +1498,16 @@
           <w:u w:val="single"/>
           <w:rtl/>
         </w:rPr>
-        <w:t>יצירת חשבון חדש עבור משתמש חדש</w:t>
-      </w:r>
-    </w:p>
-    <w:p>
-      <w:pPr>
-        <w:bidi/>
-        <w:rPr>
-          <w:rtl/>
-        </w:rPr>
-      </w:pPr>
+        <w:t xml:space="preserve">יצירת חשבון חדש </w:t>
+      </w:r>
+      <w:r>
+        <w:rPr>
+          <w:sz w:val="44"/>
+          <w:szCs w:val="44"/>
+          <w:u w:val="single"/>
+        </w:rPr>
+        <w:t>Signup.html</w:t>
+      </w:r>
     </w:p>
     <w:p>
       <w:pPr>
@@ -1364,29 +1574,6 @@
         </w:rPr>
         <w:t>לעצמו משתמש חדש.</w:t>
       </w:r>
-    </w:p>
-    <w:p>
-      <w:pPr>
-        <w:bidi/>
-        <w:rPr>
-          <w:rtl/>
-        </w:rPr>
-      </w:pPr>
-      <w:r>
-        <w:rPr>
-          <w:rFonts w:hint="cs"/>
-          <w:rtl/>
-        </w:rPr>
-        <w:t>בנוסף, באמצעות סרגל הניווט שמופיע בראש העמוד, ניתן לעבור בין העבומדים הבאים על ידי לחיצה על הטקסט/כפתור מתאים: עמוד הבית, לתכנן חופשה (לתכנן), להזמין חופשה או בגדים (להזמין), טיסות (טיסה), צור קשר.</w:t>
-      </w:r>
-    </w:p>
-    <w:p>
-      <w:pPr>
-        <w:bidi/>
-        <w:rPr>
-          <w:rtl/>
-        </w:rPr>
-      </w:pPr>
     </w:p>
     <w:p>
       <w:pPr>
@@ -1559,7 +1746,28 @@
           <w:rFonts w:hint="cs"/>
           <w:rtl/>
         </w:rPr>
-        <w:t xml:space="preserve">הזמן פרטי </w:t>
+        <w:t>מכניס</w:t>
+      </w:r>
+      <w:r>
+        <w:rPr>
+          <w:rFonts w:hint="cs"/>
+          <w:rtl/>
+        </w:rPr>
+        <w:t xml:space="preserve"> פרטי</w:t>
+      </w:r>
+      <w:r>
+        <w:rPr>
+          <w:rFonts w:hint="cs"/>
+          <w:rtl/>
+        </w:rPr>
+        <w:t>ם</w:t>
+      </w:r>
+      <w:r>
+        <w:rPr>
+          <w:rFonts w:hint="cs"/>
+          <w:rtl/>
+        </w:rPr>
+        <w:t xml:space="preserve"> </w:t>
       </w:r>
       <w:r>
         <w:rPr>
@@ -1882,24 +2090,29 @@
           <w:rtl/>
         </w:rPr>
       </w:pPr>
-      <w:r>
-        <w:rPr>
-          <w:rFonts w:hint="cs"/>
+    </w:p>
+    <w:p>
+      <w:pPr>
+        <w:bidi/>
+        <w:rPr>
           <w:sz w:val="44"/>
           <w:szCs w:val="44"/>
           <w:u w:val="single"/>
           <w:rtl/>
         </w:rPr>
-        <w:t>עמוד</w:t>
-      </w:r>
-      <w:r>
-        <w:rPr>
+      </w:pPr>
+    </w:p>
+    <w:p>
+      <w:pPr>
+        <w:bidi/>
+        <w:rPr>
+          <w:rFonts w:hint="cs"/>
           <w:sz w:val="44"/>
           <w:szCs w:val="44"/>
           <w:u w:val="single"/>
-        </w:rPr>
-        <w:t xml:space="preserve"> </w:t>
-      </w:r>
+          <w:rtl/>
+        </w:rPr>
+      </w:pPr>
       <w:r>
         <w:rPr>
           <w:rFonts w:hint="cs"/>
@@ -1908,16 +2121,45 @@
           <w:u w:val="single"/>
           <w:rtl/>
         </w:rPr>
+        <w:lastRenderedPageBreak/>
+        <w:t>עמוד</w:t>
+      </w:r>
+      <w:r>
+        <w:rPr>
+          <w:sz w:val="44"/>
+          <w:szCs w:val="44"/>
+          <w:u w:val="single"/>
+        </w:rPr>
+        <w:t xml:space="preserve"> </w:t>
+      </w:r>
+      <w:r>
+        <w:rPr>
+          <w:rFonts w:hint="cs"/>
+          <w:sz w:val="44"/>
+          <w:szCs w:val="44"/>
+          <w:u w:val="single"/>
+          <w:rtl/>
+        </w:rPr>
         <w:t>איפוס פרטי התחברות</w:t>
       </w:r>
-    </w:p>
-    <w:p>
-      <w:pPr>
-        <w:bidi/>
-        <w:rPr>
-          <w:rtl/>
-        </w:rPr>
-      </w:pPr>
+      <w:r>
+        <w:rPr>
+          <w:rFonts w:hint="cs"/>
+          <w:sz w:val="44"/>
+          <w:szCs w:val="44"/>
+          <w:u w:val="single"/>
+          <w:rtl/>
+        </w:rPr>
+        <w:t xml:space="preserve"> - </w:t>
+      </w:r>
+      <w:r>
+        <w:rPr>
+          <w:sz w:val="44"/>
+          <w:szCs w:val="44"/>
+          <w:u w:val="single"/>
+        </w:rPr>
+        <w:t>ForgotCredentials.html</w:t>
+      </w:r>
     </w:p>
     <w:p>
       <w:pPr>
@@ -2041,21 +2283,6 @@
           <w:rtl/>
         </w:rPr>
         <w:t>להתחבר.</w:t>
-      </w:r>
-    </w:p>
-    <w:p>
-      <w:pPr>
-        <w:bidi/>
-        <w:rPr>
-          <w:rtl/>
-        </w:rPr>
-      </w:pPr>
-      <w:r>
-        <w:rPr>
-          <w:rFonts w:hint="cs"/>
-          <w:rtl/>
-        </w:rPr>
-        <w:t>בנוסף, באמצעות סרגל הניווט שמופיע בראש העמוד, ניתן לעבור בין העבומדים הבאים על ידי לחיצה על הטקסט/כפתור מתאים: עמוד הבית, לתכנן חופשה (לתכנן), להזמין חופשה או בגדים (להזמין), טיסות (טיסה), צור קשר.</w:t>
       </w:r>
     </w:p>
     <w:p>
@@ -2173,7 +2400,21 @@
           <w:rFonts w:hint="cs"/>
           <w:rtl/>
         </w:rPr>
-        <w:t xml:space="preserve">הזמת פרטים אישיים </w:t>
+        <w:t>הז</w:t>
+      </w:r>
+      <w:r>
+        <w:rPr>
+          <w:rFonts w:hint="cs"/>
+          <w:rtl/>
+        </w:rPr>
+        <w:t>נ</w:t>
+      </w:r>
+      <w:r>
+        <w:rPr>
+          <w:rFonts w:hint="cs"/>
+          <w:rtl/>
+        </w:rPr>
+        <w:t xml:space="preserve">ת פרטים אישיים </w:t>
       </w:r>
       <w:r>
         <w:rPr>
@@ -2258,26 +2499,6 @@
     </w:p>
     <w:p>
       <w:pPr>
-        <w:pStyle w:val="ListParagraph"/>
-        <w:numPr>
-          <w:ilvl w:val="0"/>
-          <w:numId w:val="5"/>
-        </w:numPr>
-        <w:bidi/>
-        <w:rPr>
-          <w:rtl/>
-        </w:rPr>
-      </w:pPr>
-      <w:r>
-        <w:rPr>
-          <w:rFonts w:hint="cs"/>
-          <w:rtl/>
-        </w:rPr>
-        <w:t>לחיצה על כפתור -  מעבר בין עמודים לפי סרגל הניווט.</w:t>
-      </w:r>
-    </w:p>
-    <w:p>
-      <w:pPr>
         <w:bidi/>
         <w:rPr>
           <w:rtl/>
@@ -2391,7 +2612,6 @@
           <w:rFonts w:hint="cs"/>
           <w:rtl/>
         </w:rPr>
-        <w:lastRenderedPageBreak/>
         <w:t>מעבר בין עמודים על ידי קליטת הלחיצות של הכפתורים.</w:t>
       </w:r>
     </w:p>
@@ -2405,24 +2625,28 @@
           <w:rtl/>
         </w:rPr>
       </w:pPr>
-      <w:r>
-        <w:rPr>
-          <w:rFonts w:hint="cs"/>
+    </w:p>
+    <w:p>
+      <w:pPr>
+        <w:bidi/>
+        <w:rPr>
           <w:sz w:val="44"/>
           <w:szCs w:val="44"/>
           <w:u w:val="single"/>
           <w:rtl/>
         </w:rPr>
-        <w:t>עמוד</w:t>
-      </w:r>
-      <w:r>
+      </w:pPr>
+    </w:p>
+    <w:p>
+      <w:pPr>
+        <w:bidi/>
         <w:rPr>
           <w:sz w:val="44"/>
           <w:szCs w:val="44"/>
           <w:u w:val="single"/>
-        </w:rPr>
-        <w:t xml:space="preserve"> </w:t>
-      </w:r>
+          <w:rtl/>
+        </w:rPr>
+      </w:pPr>
       <w:r>
         <w:rPr>
           <w:rFonts w:hint="cs"/>
@@ -2431,16 +2655,45 @@
           <w:u w:val="single"/>
           <w:rtl/>
         </w:rPr>
+        <w:lastRenderedPageBreak/>
+        <w:t>עמוד</w:t>
+      </w:r>
+      <w:r>
+        <w:rPr>
+          <w:sz w:val="44"/>
+          <w:szCs w:val="44"/>
+          <w:u w:val="single"/>
+        </w:rPr>
+        <w:t xml:space="preserve"> </w:t>
+      </w:r>
+      <w:r>
+        <w:rPr>
+          <w:rFonts w:hint="cs"/>
+          <w:sz w:val="44"/>
+          <w:szCs w:val="44"/>
+          <w:u w:val="single"/>
+          <w:rtl/>
+        </w:rPr>
         <w:t>הבית</w:t>
       </w:r>
-    </w:p>
-    <w:p>
-      <w:pPr>
-        <w:bidi/>
-        <w:rPr>
-          <w:rtl/>
-        </w:rPr>
-      </w:pPr>
+      <w:r>
+        <w:rPr>
+          <w:rFonts w:hint="cs"/>
+          <w:sz w:val="44"/>
+          <w:szCs w:val="44"/>
+          <w:u w:val="single"/>
+          <w:rtl/>
+        </w:rPr>
+        <w:t xml:space="preserve"> - </w:t>
+      </w:r>
+      <w:r>
+        <w:rPr>
+          <w:sz w:val="44"/>
+          <w:szCs w:val="44"/>
+          <w:u w:val="single"/>
+        </w:rPr>
+        <w:t>Homepage.html</w:t>
+      </w:r>
     </w:p>
     <w:p>
       <w:pPr>
@@ -2556,7 +2809,21 @@
           <w:rFonts w:hint="cs"/>
           <w:rtl/>
         </w:rPr>
-        <w:t>בנוסף, באמצעות סרגל הניווט שמופיע בראש העמוד, ניתן לעבור בין העבומדים הבאים על ידי לחיצה על הטקסט/כפתור מתאים: עמוד הבית, לתכנן חופשה (לתכנן), להזמין חופשה או בגדים (להזמין), טיסות (טיסה), צור קשר.</w:t>
+        <w:t>בנוסף, באמצעות סרגל הניווט שמופיע בראש העמוד, ניתן לעבור בין הע</w:t>
+      </w:r>
+      <w:r>
+        <w:rPr>
+          <w:rFonts w:hint="cs"/>
+          <w:rtl/>
+        </w:rPr>
+        <w:t>מ</w:t>
+      </w:r>
+      <w:r>
+        <w:rPr>
+          <w:rFonts w:hint="cs"/>
+          <w:rtl/>
+        </w:rPr>
+        <w:t>ודים הבאים על ידי לחיצה על הטקסט/כפתור מתאים: עמוד הבית, לתכנן חופשה (לתכנן), להזמין חופשה או בגדים (להזמין), טיסות (טיסה), צור קשר.</w:t>
       </w:r>
     </w:p>
     <w:p>
@@ -2678,9 +2945,6 @@
           <w:numId w:val="8"/>
         </w:numPr>
         <w:bidi/>
-        <w:rPr>
-          <w:rtl/>
-        </w:rPr>
       </w:pPr>
       <w:r>
         <w:rPr>
@@ -2701,41 +2965,6 @@
           <w:rtl/>
         </w:rPr>
         <w:t xml:space="preserve"> גלילה בסרגלים השונים.</w:t>
-      </w:r>
-    </w:p>
-    <w:p>
-      <w:pPr>
-        <w:bidi/>
-        <w:rPr>
-          <w:rtl/>
-        </w:rPr>
-      </w:pPr>
-    </w:p>
-    <w:p>
-      <w:pPr>
-        <w:bidi/>
-        <w:rPr>
-          <w:sz w:val="28"/>
-          <w:szCs w:val="28"/>
-          <w:rtl/>
-        </w:rPr>
-      </w:pPr>
-      <w:r>
-        <w:rPr>
-          <w:rFonts w:hint="cs"/>
-          <w:sz w:val="28"/>
-          <w:szCs w:val="28"/>
-          <w:u w:val="single"/>
-          <w:rtl/>
-        </w:rPr>
-        <w:t>פעולות המתבצעות על ידי האתר</w:t>
-      </w:r>
-      <w:r>
-        <w:rPr>
-          <w:sz w:val="28"/>
-          <w:szCs w:val="28"/>
-        </w:rPr>
-        <w:t>:</w:t>
       </w:r>
     </w:p>
     <w:p>
@@ -2743,51 +2972,20 @@
         <w:pStyle w:val="ListParagraph"/>
         <w:numPr>
           <w:ilvl w:val="0"/>
-          <w:numId w:val="9"/>
+          <w:numId w:val="8"/>
         </w:numPr>
         <w:bidi/>
-      </w:pPr>
-      <w:r>
-        <w:rPr>
-          <w:rFonts w:hint="cs"/>
-          <w:rtl/>
-        </w:rPr>
-        <w:t>מעבר בין עמודים על ידי קליטת הלחיצות של הכפתורים.</w:t>
-      </w:r>
-    </w:p>
-    <w:p>
-      <w:pPr>
-        <w:pStyle w:val="ListParagraph"/>
-        <w:numPr>
-          <w:ilvl w:val="0"/>
-          <w:numId w:val="9"/>
-        </w:numPr>
-        <w:bidi/>
-      </w:pPr>
-      <w:r>
-        <w:rPr>
-          <w:rFonts w:hint="cs"/>
-          <w:rtl/>
-        </w:rPr>
-        <w:t>מעבר בין נושאים על ידי קליטת הלחיצות של הכפתורים.</w:t>
-      </w:r>
-    </w:p>
-    <w:p>
-      <w:pPr>
-        <w:pStyle w:val="ListParagraph"/>
-        <w:numPr>
-          <w:ilvl w:val="0"/>
-          <w:numId w:val="9"/>
-        </w:numPr>
-        <w:bidi/>
-      </w:pPr>
-    </w:p>
-    <w:p>
-      <w:pPr>
-        <w:rPr>
-          <w:rtl/>
-        </w:rPr>
-      </w:pPr>
+        <w:rPr>
+          <w:rtl/>
+        </w:rPr>
+      </w:pPr>
+      <w:r>
+        <w:rPr>
+          <w:rFonts w:hint="cs"/>
+          <w:rtl/>
+        </w:rPr>
+        <w:t>חיפוש מיקומים ואטרקציות לפי מיקום במפה.</w:t>
+      </w:r>
       <w:r>
         <w:rPr>
           <w:rtl/>
@@ -2799,29 +2997,37 @@
       <w:pPr>
         <w:bidi/>
         <w:rPr>
+          <w:rtl/>
+        </w:rPr>
+      </w:pPr>
+      <w:r>
+        <w:rPr>
+          <w:rFonts w:hint="cs"/>
           <w:sz w:val="44"/>
           <w:szCs w:val="44"/>
-          <w:rtl/>
-        </w:rPr>
-      </w:pPr>
-      <w:r>
-        <w:rPr>
-          <w:rFonts w:hint="cs"/>
+          <w:u w:val="single"/>
+          <w:rtl/>
+        </w:rPr>
+        <w:lastRenderedPageBreak/>
+        <w:t>עמוד</w:t>
+      </w:r>
+      <w:r>
+        <w:rPr>
           <w:sz w:val="44"/>
           <w:szCs w:val="44"/>
           <w:u w:val="single"/>
-          <w:rtl/>
-        </w:rPr>
-        <w:lastRenderedPageBreak/>
-        <w:t>עמוד</w:t>
-      </w:r>
-      <w:r>
-        <w:rPr>
+        </w:rPr>
+        <w:t xml:space="preserve"> </w:t>
+      </w:r>
+      <w:r>
+        <w:rPr>
+          <w:rFonts w:hint="cs"/>
           <w:sz w:val="44"/>
           <w:szCs w:val="44"/>
           <w:u w:val="single"/>
-        </w:rPr>
-        <w:t xml:space="preserve"> </w:t>
+          <w:rtl/>
+        </w:rPr>
+        <w:t>הרשמה למנוי פרימיום</w:t>
       </w:r>
       <w:r>
         <w:rPr>
@@ -2831,25 +3037,19 @@
           <w:u w:val="single"/>
           <w:rtl/>
         </w:rPr>
-        <w:t>הרשמה למנוי פרימיום</w:t>
-      </w:r>
-      <w:r>
-        <w:rPr>
-          <w:rFonts w:hint="cs"/>
+        <w:t xml:space="preserve"> -</w:t>
+      </w:r>
+      <w:r>
+        <w:t xml:space="preserve"> </w:t>
+      </w:r>
+      <w:r>
+        <w:rPr>
           <w:sz w:val="44"/>
           <w:szCs w:val="44"/>
-          <w:rtl/>
-        </w:rPr>
-        <w:t>:</w:t>
-      </w:r>
-    </w:p>
-    <w:p>
-      <w:pPr>
-        <w:bidi/>
-        <w:rPr>
-          <w:rtl/>
-        </w:rPr>
-      </w:pPr>
+          <w:u w:val="single"/>
+        </w:rPr>
+        <w:t>PremiumAccount.html</w:t>
+      </w:r>
     </w:p>
     <w:p>
       <w:pPr>
@@ -4474,25 +4674,25 @@
           <w:rtl/>
         </w:rPr>
         <w:lastRenderedPageBreak/>
-        <w:t>עמוד</w:t>
-      </w:r>
-      <w:r>
-        <w:rPr>
+        <w:t>עמוד צור קשר</w:t>
+      </w:r>
+      <w:r>
+        <w:rPr>
+          <w:rFonts w:hint="cs"/>
           <w:sz w:val="44"/>
           <w:szCs w:val="44"/>
           <w:u w:val="single"/>
-        </w:rPr>
-        <w:t xml:space="preserve"> </w:t>
-      </w:r>
-      <w:r>
-        <w:rPr>
-          <w:rFonts w:hint="cs"/>
+          <w:rtl/>
+        </w:rPr>
+        <w:t xml:space="preserve"> - </w:t>
+      </w:r>
+      <w:r>
+        <w:rPr>
           <w:sz w:val="44"/>
           <w:szCs w:val="44"/>
           <w:u w:val="single"/>
-          <w:rtl/>
-        </w:rPr>
-        <w:t>התשלום למנוי פרימיום</w:t>
+        </w:rPr>
+        <w:t>ContactUs.html</w:t>
       </w:r>
       <w:r>
         <w:rPr>
@@ -4516,14 +4716,6 @@
       <w:pPr>
         <w:bidi/>
         <w:rPr>
-          <w:rtl/>
-        </w:rPr>
-      </w:pPr>
-    </w:p>
-    <w:p>
-      <w:pPr>
-        <w:bidi/>
-        <w:rPr>
           <w:sz w:val="28"/>
           <w:szCs w:val="28"/>
           <w:rtl/>
@@ -4553,6 +4745,25 @@
       <w:pPr>
         <w:bidi/>
         <w:rPr>
+          <w:sz w:val="28"/>
+          <w:szCs w:val="28"/>
+          <w:rtl/>
+        </w:rPr>
+      </w:pPr>
+      <w:r>
+        <w:rPr>
+          <w:rFonts w:hint="cs"/>
+          <w:sz w:val="28"/>
+          <w:szCs w:val="28"/>
+          <w:rtl/>
+        </w:rPr>
+        <w:t>העמוד מאפשר דרך לתקשר עם הארגון דרך מילוי טופס בסיס</w:t>
+      </w:r>
+    </w:p>
+    <w:p>
+      <w:pPr>
+        <w:bidi/>
+        <w:rPr>
           <w:rtl/>
         </w:rPr>
       </w:pPr>
@@ -4584,6 +4795,21 @@
           <w:rtl/>
         </w:rPr>
         <w:t>?</w:t>
+      </w:r>
+    </w:p>
+    <w:p>
+      <w:pPr>
+        <w:bidi/>
+        <w:rPr>
+          <w:rtl/>
+        </w:rPr>
+      </w:pPr>
+      <w:r>
+        <w:rPr>
+          <w:rFonts w:hint="cs"/>
+          <w:rtl/>
+        </w:rPr>
+        <w:t>נותן למשתמשים דרך ליצור קשר עם הארגון לדיווח על בעיות או פידבאק</w:t>
       </w:r>
     </w:p>
     <w:p>
@@ -4626,28 +4852,50 @@
         <w:pStyle w:val="ListParagraph"/>
         <w:numPr>
           <w:ilvl w:val="0"/>
-          <w:numId w:val="11"/>
+          <w:numId w:val="13"/>
         </w:numPr>
         <w:bidi/>
-        <w:rPr>
-          <w:rtl/>
-        </w:rPr>
-      </w:pPr>
-      <w:r>
-        <w:rPr>
-          <w:rFonts w:hint="cs"/>
-          <w:rtl/>
-        </w:rPr>
-        <w:t>לחיצה על כפתור -  מעבר בין עמודים לפי סרגל הניווט.</w:t>
-      </w:r>
-    </w:p>
-    <w:p>
-      <w:pPr>
-        <w:bidi/>
-        <w:rPr>
-          <w:rtl/>
-        </w:rPr>
-      </w:pPr>
+      </w:pPr>
+      <w:r>
+        <w:rPr>
+          <w:rFonts w:hint="cs"/>
+          <w:rtl/>
+        </w:rPr>
+        <w:t>מילוי הטופס:</w:t>
+      </w:r>
+      <w:r>
+        <w:rPr>
+          <w:rFonts w:hint="cs"/>
+        </w:rPr>
+        <w:t xml:space="preserve"> </w:t>
+      </w:r>
+      <w:r>
+        <w:rPr>
+          <w:rFonts w:hint="cs"/>
+          <w:rtl/>
+        </w:rPr>
+        <w:t>שם, מייל, ומה שרוצים להגיד</w:t>
+      </w:r>
+    </w:p>
+    <w:p>
+      <w:pPr>
+        <w:pStyle w:val="ListParagraph"/>
+        <w:numPr>
+          <w:ilvl w:val="0"/>
+          <w:numId w:val="13"/>
+        </w:numPr>
+        <w:bidi/>
+        <w:rPr>
+          <w:rtl/>
+        </w:rPr>
+      </w:pPr>
+      <w:r>
+        <w:rPr>
+          <w:rFonts w:hint="cs"/>
+          <w:rtl/>
+        </w:rPr>
+        <w:t>שליחת הטופס על ידי כפתור שלח</w:t>
+      </w:r>
     </w:p>
     <w:p>
       <w:pPr>
@@ -4690,21 +4938,112 @@
           <w:rFonts w:hint="cs"/>
           <w:rtl/>
         </w:rPr>
-        <w:t>מעבר בין עמודים על ידי קליטת הלחיצות של הכפתורים.</w:t>
-      </w:r>
-    </w:p>
-    <w:p>
-      <w:pPr>
-        <w:rPr>
-          <w:rtl/>
-        </w:rPr>
-      </w:pPr>
-      <w:r>
-        <w:rPr>
-          <w:rtl/>
-        </w:rPr>
-        <w:br w:type="page"/>
-      </w:r>
+        <w:t>שליחת הטופס למקומות הרלוונטיים.</w:t>
+      </w:r>
+    </w:p>
+    <w:p>
+      <w:pPr>
+        <w:bidi/>
+        <w:rPr>
+          <w:rtl/>
+        </w:rPr>
+      </w:pPr>
+    </w:p>
+    <w:p>
+      <w:pPr>
+        <w:bidi/>
+        <w:rPr>
+          <w:rtl/>
+        </w:rPr>
+      </w:pPr>
+    </w:p>
+    <w:p>
+      <w:pPr>
+        <w:bidi/>
+        <w:rPr>
+          <w:rtl/>
+        </w:rPr>
+      </w:pPr>
+    </w:p>
+    <w:p>
+      <w:pPr>
+        <w:bidi/>
+        <w:rPr>
+          <w:rtl/>
+        </w:rPr>
+      </w:pPr>
+    </w:p>
+    <w:p>
+      <w:pPr>
+        <w:bidi/>
+        <w:rPr>
+          <w:rtl/>
+        </w:rPr>
+      </w:pPr>
+    </w:p>
+    <w:p>
+      <w:pPr>
+        <w:bidi/>
+        <w:rPr>
+          <w:rtl/>
+        </w:rPr>
+      </w:pPr>
+    </w:p>
+    <w:p>
+      <w:pPr>
+        <w:bidi/>
+        <w:rPr>
+          <w:rtl/>
+        </w:rPr>
+      </w:pPr>
+    </w:p>
+    <w:p>
+      <w:pPr>
+        <w:bidi/>
+        <w:rPr>
+          <w:rtl/>
+        </w:rPr>
+      </w:pPr>
+    </w:p>
+    <w:p>
+      <w:pPr>
+        <w:bidi/>
+        <w:rPr>
+          <w:rtl/>
+        </w:rPr>
+      </w:pPr>
+    </w:p>
+    <w:p>
+      <w:pPr>
+        <w:bidi/>
+        <w:rPr>
+          <w:rtl/>
+        </w:rPr>
+      </w:pPr>
+    </w:p>
+    <w:p>
+      <w:pPr>
+        <w:bidi/>
+        <w:rPr>
+          <w:rtl/>
+        </w:rPr>
+      </w:pPr>
+    </w:p>
+    <w:p>
+      <w:pPr>
+        <w:bidi/>
+        <w:rPr>
+          <w:rtl/>
+        </w:rPr>
+      </w:pPr>
+    </w:p>
+    <w:p>
+      <w:pPr>
+        <w:bidi/>
+        <w:rPr>
+          <w:rtl/>
+        </w:rPr>
+      </w:pPr>
     </w:p>
     <w:p>
       <w:pPr>
@@ -4724,7 +5063,7 @@
           <w:rtl/>
         </w:rPr>
         <w:lastRenderedPageBreak/>
-        <w:t>עמוד צור קשר</w:t>
+        <w:t>עמודי חיפוש אטרקציות\טיסות\בגדים</w:t>
       </w:r>
       <w:r>
         <w:rPr>
@@ -4740,9 +5079,78 @@
       <w:pPr>
         <w:bidi/>
         <w:rPr>
-          <w:rtl/>
-        </w:rPr>
-      </w:pPr>
+          <w:sz w:val="28"/>
+          <w:szCs w:val="28"/>
+          <w:rtl/>
+        </w:rPr>
+      </w:pPr>
+      <w:r>
+        <w:rPr>
+          <w:sz w:val="28"/>
+          <w:szCs w:val="28"/>
+        </w:rPr>
+        <w:t>Clothes.html</w:t>
+      </w:r>
+      <w:r>
+        <w:rPr>
+          <w:rFonts w:hint="cs"/>
+          <w:sz w:val="28"/>
+          <w:szCs w:val="28"/>
+          <w:rtl/>
+        </w:rPr>
+        <w:t xml:space="preserve">, </w:t>
+      </w:r>
+      <w:r>
+        <w:rPr>
+          <w:sz w:val="28"/>
+          <w:szCs w:val="28"/>
+        </w:rPr>
+        <w:t>Flights.html</w:t>
+      </w:r>
+      <w:r>
+        <w:rPr>
+          <w:rFonts w:hint="cs"/>
+          <w:sz w:val="28"/>
+          <w:szCs w:val="28"/>
+          <w:rtl/>
+        </w:rPr>
+        <w:t xml:space="preserve">, </w:t>
+      </w:r>
+      <w:r>
+        <w:rPr>
+          <w:sz w:val="28"/>
+          <w:szCs w:val="28"/>
+        </w:rPr>
+        <w:t>Attractions.html</w:t>
+      </w:r>
+      <w:r>
+        <w:rPr>
+          <w:rFonts w:hint="cs"/>
+          <w:sz w:val="28"/>
+          <w:szCs w:val="28"/>
+          <w:rtl/>
+        </w:rPr>
+        <w:t>.</w:t>
+      </w:r>
+    </w:p>
+    <w:p>
+      <w:pPr>
+        <w:bidi/>
+        <w:rPr>
+          <w:sz w:val="44"/>
+          <w:szCs w:val="44"/>
+          <w:rtl/>
+        </w:rPr>
+      </w:pPr>
+      <w:r>
+        <w:rPr>
+          <w:rFonts w:hint="cs"/>
+          <w:sz w:val="28"/>
+          <w:szCs w:val="28"/>
+          <w:rtl/>
+        </w:rPr>
+        <w:t>שלושת העמודים האלה מאוד דומים ובנויים על אותו עקרון, אופציית חיפוש והגשת תוכן.</w:t>
+      </w:r>
     </w:p>
     <w:p>
       <w:pPr>
@@ -4785,6 +5193,34 @@
       <w:pPr>
         <w:bidi/>
         <w:rPr>
+          <w:sz w:val="28"/>
+          <w:szCs w:val="28"/>
+          <w:rtl/>
+        </w:rPr>
+      </w:pPr>
+      <w:r>
+        <w:rPr>
+          <w:rFonts w:hint="cs"/>
+          <w:sz w:val="28"/>
+          <w:szCs w:val="28"/>
+          <w:rtl/>
+        </w:rPr>
+        <w:t xml:space="preserve">העמוד מאפשר </w:t>
+      </w:r>
+      <w:r>
+        <w:rPr>
+          <w:rFonts w:hint="cs"/>
+          <w:sz w:val="28"/>
+          <w:szCs w:val="28"/>
+          <w:rtl/>
+        </w:rPr>
+        <w:t>חיפוש וסינון לפי קריטריונים של המוצרים המוצעים.</w:t>
+      </w:r>
+    </w:p>
+    <w:p>
+      <w:pPr>
+        <w:bidi/>
+        <w:rPr>
           <w:rtl/>
         </w:rPr>
       </w:pPr>
@@ -4816,6 +5252,21 @@
           <w:rtl/>
         </w:rPr>
         <w:t>?</w:t>
+      </w:r>
+    </w:p>
+    <w:p>
+      <w:pPr>
+        <w:bidi/>
+        <w:rPr>
+          <w:rtl/>
+        </w:rPr>
+      </w:pPr>
+      <w:r>
+        <w:rPr>
+          <w:rFonts w:hint="cs"/>
+          <w:rtl/>
+        </w:rPr>
+        <w:t>נותן ללקוחות לראות ולסנן לפי מה שהם רוצים כדי שיוכלו למצוא דברים מתאימים. הארגון מקבל עמלה על כל קנייה אז ככל שניתן יותר אופציות ונעשה חווית משתמש טובה יותר נרוויח יותר.</w:t>
       </w:r>
     </w:p>
     <w:p>
@@ -4858,54 +5309,16 @@
         <w:pStyle w:val="ListParagraph"/>
         <w:numPr>
           <w:ilvl w:val="0"/>
-          <w:numId w:val="13"/>
+          <w:numId w:val="17"/>
         </w:numPr>
         <w:bidi/>
-        <w:rPr>
-          <w:rtl/>
-        </w:rPr>
-      </w:pPr>
-      <w:r>
-        <w:rPr>
-          <w:rFonts w:hint="cs"/>
-          <w:rtl/>
-        </w:rPr>
-        <w:t>לחיצה על כפתור -  מעבר בין עמודים לפי סרגל הניווט.</w:t>
-      </w:r>
-    </w:p>
-    <w:p>
-      <w:pPr>
-        <w:bidi/>
-        <w:rPr>
-          <w:rtl/>
-        </w:rPr>
-      </w:pPr>
-    </w:p>
-    <w:p>
-      <w:pPr>
-        <w:bidi/>
-        <w:rPr>
-          <w:sz w:val="28"/>
-          <w:szCs w:val="28"/>
-          <w:rtl/>
-        </w:rPr>
-      </w:pPr>
-      <w:r>
-        <w:rPr>
-          <w:rFonts w:hint="cs"/>
-          <w:sz w:val="28"/>
-          <w:szCs w:val="28"/>
-          <w:u w:val="single"/>
-          <w:rtl/>
-        </w:rPr>
-        <w:t>פעולות המתבצעות על ידי האתר</w:t>
-      </w:r>
-      <w:r>
-        <w:rPr>
-          <w:sz w:val="28"/>
-          <w:szCs w:val="28"/>
-        </w:rPr>
-        <w:t>:</w:t>
+      </w:pPr>
+      <w:r>
+        <w:rPr>
+          <w:rFonts w:hint="cs"/>
+          <w:rtl/>
+        </w:rPr>
+        <w:t>סינון וחיפוש לפי העדפות.</w:t>
       </w:r>
     </w:p>
     <w:p>
@@ -4913,7 +5326,7 @@
         <w:pStyle w:val="ListParagraph"/>
         <w:numPr>
           <w:ilvl w:val="0"/>
-          <w:numId w:val="12"/>
+          <w:numId w:val="17"/>
         </w:numPr>
         <w:bidi/>
       </w:pPr>
@@ -4922,56 +5335,79 @@
           <w:rFonts w:hint="cs"/>
           <w:rtl/>
         </w:rPr>
-        <w:t>מעבר בין עמודים על ידי קליטת הלחיצות של הכפתורים.</w:t>
-      </w:r>
-    </w:p>
-    <w:p>
-      <w:pPr>
-        <w:bidi/>
-        <w:rPr>
-          <w:rtl/>
-        </w:rPr>
-      </w:pPr>
-    </w:p>
-    <w:p>
-      <w:pPr>
-        <w:bidi/>
-        <w:rPr>
-          <w:rtl/>
-        </w:rPr>
-      </w:pPr>
-    </w:p>
-    <w:p>
-      <w:pPr>
-        <w:bidi/>
-        <w:rPr>
-          <w:rtl/>
-        </w:rPr>
-      </w:pPr>
-    </w:p>
-    <w:p>
-      <w:pPr>
-        <w:bidi/>
-        <w:rPr>
-          <w:rtl/>
-        </w:rPr>
-      </w:pPr>
-    </w:p>
-    <w:p>
-      <w:pPr>
-        <w:bidi/>
-        <w:rPr>
-          <w:rtl/>
-        </w:rPr>
-      </w:pPr>
-    </w:p>
-    <w:p>
-      <w:pPr>
-        <w:bidi/>
-        <w:rPr>
-          <w:rtl/>
-        </w:rPr>
-      </w:pPr>
+        <w:t>צפייה ברשימת האופציות.</w:t>
+      </w:r>
+    </w:p>
+    <w:p>
+      <w:pPr>
+        <w:pStyle w:val="ListParagraph"/>
+        <w:numPr>
+          <w:ilvl w:val="0"/>
+          <w:numId w:val="17"/>
+        </w:numPr>
+        <w:bidi/>
+        <w:rPr>
+          <w:rtl/>
+        </w:rPr>
+      </w:pPr>
+      <w:r>
+        <w:rPr>
+          <w:rFonts w:hint="cs"/>
+          <w:rtl/>
+        </w:rPr>
+        <w:t>העברה לקנייה של המוצר.</w:t>
+      </w:r>
+    </w:p>
+    <w:p>
+      <w:pPr>
+        <w:bidi/>
+        <w:rPr>
+          <w:sz w:val="28"/>
+          <w:szCs w:val="28"/>
+          <w:rtl/>
+        </w:rPr>
+      </w:pPr>
+      <w:r>
+        <w:rPr>
+          <w:rFonts w:hint="cs"/>
+          <w:sz w:val="28"/>
+          <w:szCs w:val="28"/>
+          <w:u w:val="single"/>
+          <w:rtl/>
+        </w:rPr>
+        <w:t>פעולות המתבצעות על ידי האתר</w:t>
+      </w:r>
+      <w:r>
+        <w:rPr>
+          <w:sz w:val="28"/>
+          <w:szCs w:val="28"/>
+        </w:rPr>
+        <w:t>:</w:t>
+      </w:r>
+    </w:p>
+    <w:p>
+      <w:pPr>
+        <w:pStyle w:val="ListParagraph"/>
+        <w:numPr>
+          <w:ilvl w:val="0"/>
+          <w:numId w:val="18"/>
+        </w:numPr>
+        <w:bidi/>
+      </w:pPr>
+      <w:r>
+        <w:rPr>
+          <w:rFonts w:hint="cs"/>
+          <w:rtl/>
+        </w:rPr>
+        <w:t>סינון לפי מה שהמשתמש מכניס</w:t>
+      </w:r>
+      <w:r>
+        <w:rPr>
+          <w:rFonts w:hint="cs"/>
+          <w:rtl/>
+        </w:rPr>
+        <w:t>.</w:t>
+      </w:r>
     </w:p>
     <w:p>
       <w:pPr>
@@ -5070,98 +5506,538 @@
       <w:pPr>
         <w:bidi/>
         <w:rPr>
+          <w:sz w:val="28"/>
+          <w:szCs w:val="28"/>
+          <w:rtl/>
+        </w:rPr>
+      </w:pPr>
+      <w:r>
+        <w:rPr>
+          <w:rFonts w:hint="cs"/>
+          <w:sz w:val="28"/>
+          <w:szCs w:val="28"/>
+          <w:rtl/>
+        </w:rPr>
+        <w:t>האתר משתמש ב</w:t>
+      </w:r>
+      <w:r>
+        <w:rPr>
+          <w:sz w:val="28"/>
+          <w:szCs w:val="28"/>
+        </w:rPr>
+        <w:t>javascript</w:t>
+      </w:r>
+      <w:r>
+        <w:rPr>
+          <w:rFonts w:hint="cs"/>
+          <w:sz w:val="28"/>
+          <w:szCs w:val="28"/>
+          <w:rtl/>
+        </w:rPr>
+        <w:t xml:space="preserve"> בכמה מקומות שונים:</w:t>
+      </w:r>
+    </w:p>
+    <w:p>
+      <w:pPr>
+        <w:bidi/>
+        <w:rPr>
+          <w:sz w:val="28"/>
+          <w:szCs w:val="28"/>
+          <w:rtl/>
+        </w:rPr>
+      </w:pPr>
+      <w:r>
+        <w:rPr>
+          <w:rFonts w:hint="cs"/>
+          <w:sz w:val="28"/>
+          <w:szCs w:val="28"/>
+          <w:rtl/>
+        </w:rPr>
+        <w:t xml:space="preserve">הוספת </w:t>
+      </w:r>
+      <w:r>
+        <w:rPr>
+          <w:sz w:val="28"/>
+          <w:szCs w:val="28"/>
+        </w:rPr>
+        <w:t>header/footer</w:t>
+      </w:r>
+      <w:r>
+        <w:rPr>
+          <w:rFonts w:hint="cs"/>
+          <w:sz w:val="28"/>
+          <w:szCs w:val="28"/>
+          <w:rtl/>
+        </w:rPr>
+        <w:t xml:space="preserve"> אוטומטי</w:t>
+      </w:r>
+      <w:r>
+        <w:rPr>
+          <w:rFonts w:hint="cs"/>
+          <w:sz w:val="28"/>
+          <w:szCs w:val="28"/>
+          <w:rtl/>
+        </w:rPr>
+        <w:t>:</w:t>
+      </w:r>
+      <w:r>
+        <w:rPr>
+          <w:rFonts w:hint="cs"/>
+          <w:sz w:val="28"/>
+          <w:szCs w:val="28"/>
+        </w:rPr>
+        <w:t xml:space="preserve"> </w:t>
+      </w:r>
+      <w:r>
+        <w:rPr>
+          <w:rFonts w:hint="cs"/>
+          <w:sz w:val="28"/>
+          <w:szCs w:val="28"/>
+          <w:rtl/>
+        </w:rPr>
+        <w:t xml:space="preserve"> </w:t>
+      </w:r>
+    </w:p>
+    <w:p>
+      <w:pPr>
+        <w:bidi/>
+        <w:rPr>
+          <w:rFonts w:hint="cs"/>
+          <w:sz w:val="28"/>
+          <w:szCs w:val="28"/>
+          <w:rtl/>
+        </w:rPr>
+      </w:pPr>
+      <w:r>
+        <w:rPr>
+          <w:rFonts w:hint="cs"/>
+          <w:sz w:val="28"/>
+          <w:szCs w:val="28"/>
+          <w:rtl/>
+        </w:rPr>
+        <w:t xml:space="preserve">הקובץ </w:t>
+      </w:r>
+      <w:r>
+        <w:rPr>
+          <w:sz w:val="28"/>
+          <w:szCs w:val="28"/>
+        </w:rPr>
+        <w:t>templateLoad.js</w:t>
+      </w:r>
+      <w:r>
+        <w:rPr>
+          <w:rFonts w:hint="cs"/>
+          <w:sz w:val="28"/>
+          <w:szCs w:val="28"/>
+          <w:rtl/>
+        </w:rPr>
+        <w:t xml:space="preserve"> שאנחנו קוראים לו בכל עמוד, טוען את הסרגל ניווט ואת ה-</w:t>
+      </w:r>
+      <w:r>
+        <w:rPr>
+          <w:sz w:val="28"/>
+          <w:szCs w:val="28"/>
+        </w:rPr>
+        <w:t>footer</w:t>
+      </w:r>
+      <w:r>
+        <w:rPr>
+          <w:rFonts w:hint="cs"/>
+          <w:sz w:val="28"/>
+          <w:szCs w:val="28"/>
+          <w:rtl/>
+        </w:rPr>
+        <w:t>. זה פועל בצורה פשוטה, יש שם שני משתנים שמכילים את כל התוכן ופשוט כשהאתר נתען אנחנו מדביקים את התוכן לפני ואחרי התוכן בעמוד עצמו.</w:t>
+      </w:r>
+      <w:r>
+        <w:rPr>
+          <w:noProof/>
+        </w:rPr>
+        <w:t xml:space="preserve"> </w:t>
+      </w:r>
+      <w:r>
+        <w:rPr>
+          <w:rFonts w:cs="Arial"/>
+          <w:sz w:val="28"/>
+          <w:szCs w:val="28"/>
+          <w:rtl/>
+        </w:rPr>
+        <w:drawing>
+          <wp:inline distT="0" distB="0" distL="0" distR="0" wp14:anchorId="7F2106CD" wp14:editId="778CC58C">
+            <wp:extent cx="3451860" cy="1676262"/>
+            <wp:effectExtent l="0" t="0" r="0" b="635"/>
+            <wp:docPr id="4" name="Picture 4"/>
+            <wp:cNvGraphicFramePr>
+              <a:graphicFrameLocks xmlns:a="http://schemas.openxmlformats.org/drawingml/2006/main" noChangeAspect="1"/>
+            </wp:cNvGraphicFramePr>
+            <a:graphic xmlns:a="http://schemas.openxmlformats.org/drawingml/2006/main">
+              <a:graphicData uri="http://schemas.openxmlformats.org/drawingml/2006/picture">
+                <pic:pic xmlns:pic="http://schemas.openxmlformats.org/drawingml/2006/picture">
+                  <pic:nvPicPr>
+                    <pic:cNvPr id="1" name=""/>
+                    <pic:cNvPicPr/>
+                  </pic:nvPicPr>
+                  <pic:blipFill>
+                    <a:blip r:embed="rId10"/>
+                    <a:stretch>
+                      <a:fillRect/>
+                    </a:stretch>
+                  </pic:blipFill>
+                  <pic:spPr>
+                    <a:xfrm>
+                      <a:off x="0" y="0"/>
+                      <a:ext cx="3563079" cy="1730271"/>
+                    </a:xfrm>
+                    <a:prstGeom prst="rect">
+                      <a:avLst/>
+                    </a:prstGeom>
+                  </pic:spPr>
+                </pic:pic>
+              </a:graphicData>
+            </a:graphic>
+          </wp:inline>
+        </w:drawing>
+      </w:r>
+    </w:p>
+    <w:p>
+      <w:pPr>
+        <w:bidi/>
+        <w:rPr>
+          <w:sz w:val="28"/>
+          <w:szCs w:val="28"/>
+          <w:rtl/>
+        </w:rPr>
+      </w:pPr>
+    </w:p>
+    <w:p>
+      <w:pPr>
+        <w:bidi/>
+        <w:rPr>
+          <w:sz w:val="28"/>
+          <w:szCs w:val="28"/>
+          <w:rtl/>
+        </w:rPr>
+      </w:pPr>
+      <w:r>
+        <w:rPr>
+          <w:rFonts w:hint="cs"/>
+          <w:sz w:val="28"/>
+          <w:szCs w:val="28"/>
+          <w:rtl/>
+        </w:rPr>
+        <w:t>קרוסלה של תמונות:</w:t>
+      </w:r>
+    </w:p>
+    <w:p>
+      <w:pPr>
+        <w:bidi/>
+        <w:rPr>
+          <w:rFonts w:hint="cs"/>
+          <w:sz w:val="28"/>
+          <w:szCs w:val="28"/>
+          <w:rtl/>
+          <w:lang w:val="en-IL"/>
+        </w:rPr>
+      </w:pPr>
+      <w:r>
+        <w:rPr>
+          <w:rFonts w:hint="cs"/>
+          <w:sz w:val="28"/>
+          <w:szCs w:val="28"/>
+          <w:rtl/>
+        </w:rPr>
+        <w:t xml:space="preserve">בעמוד הבית שמנו קרוסלה של תמונות, כדי להשתמש בזה צריך לטעון את </w:t>
+      </w:r>
+      <w:r>
+        <w:rPr>
+          <w:sz w:val="28"/>
+          <w:szCs w:val="28"/>
+        </w:rPr>
+        <w:t>imageCarousel.js</w:t>
+      </w:r>
+      <w:r>
+        <w:rPr>
+          <w:rFonts w:hint="cs"/>
+          <w:sz w:val="28"/>
+          <w:szCs w:val="28"/>
+          <w:rtl/>
+        </w:rPr>
+        <w:t xml:space="preserve">. הקוד מחפש </w:t>
+      </w:r>
+      <w:r>
+        <w:rPr>
+          <w:sz w:val="28"/>
+          <w:szCs w:val="28"/>
+        </w:rPr>
+        <w:t>div</w:t>
+      </w:r>
+      <w:r>
+        <w:rPr>
+          <w:rFonts w:hint="cs"/>
+          <w:sz w:val="28"/>
+          <w:szCs w:val="28"/>
+          <w:rtl/>
+        </w:rPr>
+        <w:t xml:space="preserve"> מהמחלקה </w:t>
+      </w:r>
+      <w:r>
+        <w:rPr>
+          <w:sz w:val="28"/>
+          <w:szCs w:val="28"/>
+        </w:rPr>
+        <w:t>image-carousel</w:t>
+      </w:r>
+      <w:r>
+        <w:rPr>
+          <w:rFonts w:hint="cs"/>
+          <w:sz w:val="28"/>
+          <w:szCs w:val="28"/>
+          <w:rtl/>
+        </w:rPr>
+        <w:t xml:space="preserve"> מחביא את כל התמונות בה חוץ מ-1 ושומר כמה תמונות יש ורשימה של הפניות לתמונות. כל 3 שניות הוא יחביא את התמונה הישנה ויציג את הבא בתור.</w:t>
+      </w:r>
+    </w:p>
+    <w:p>
+      <w:pPr>
+        <w:bidi/>
+        <w:rPr>
           <w:sz w:val="36"/>
           <w:szCs w:val="28"/>
         </w:rPr>
       </w:pPr>
-      <w:r>
-        <w:rPr>
-          <w:rFonts w:hint="cs"/>
-          <w:sz w:val="36"/>
-          <w:szCs w:val="28"/>
-          <w:rtl/>
-        </w:rPr>
-        <w:t xml:space="preserve">קרוסלה של תמונות </w:t>
-      </w:r>
-      <w:r>
-        <w:rPr>
-          <w:sz w:val="36"/>
-          <w:szCs w:val="28"/>
-          <w:rtl/>
-        </w:rPr>
-        <w:t>–</w:t>
-      </w:r>
-      <w:r>
-        <w:rPr>
-          <w:rFonts w:hint="cs"/>
-          <w:sz w:val="36"/>
-          <w:szCs w:val="28"/>
-          <w:rtl/>
-        </w:rPr>
-        <w:t xml:space="preserve"> כל עמוד עם הסקריפט יוכל להוסיף </w:t>
-      </w:r>
-      <w:r>
-        <w:rPr>
-          <w:sz w:val="36"/>
-          <w:szCs w:val="28"/>
-        </w:rPr>
-        <w:t>div</w:t>
-      </w:r>
-      <w:r>
-        <w:rPr>
-          <w:rFonts w:hint="cs"/>
-          <w:sz w:val="36"/>
-          <w:szCs w:val="28"/>
-          <w:rtl/>
-        </w:rPr>
-        <w:t xml:space="preserve"> עם תמונות שיתחלפו ביניהם כל 3 שניות.</w:t>
-      </w:r>
-    </w:p>
-    <w:p>
-      <w:pPr>
-        <w:bidi/>
-        <w:rPr>
-          <w:sz w:val="36"/>
-          <w:szCs w:val="28"/>
-        </w:rPr>
-      </w:pPr>
-    </w:p>
-    <w:p>
-      <w:pPr>
-        <w:bidi/>
-        <w:rPr>
-          <w:rFonts w:hint="cs"/>
-          <w:rtl/>
-        </w:rPr>
-      </w:pPr>
-      <w:r>
-        <w:rPr>
-          <w:rFonts w:hint="cs"/>
-          <w:sz w:val="36"/>
-          <w:szCs w:val="28"/>
-          <w:rtl/>
-        </w:rPr>
-        <w:t xml:space="preserve">הוספת </w:t>
-      </w:r>
-      <w:r>
-        <w:rPr>
-          <w:sz w:val="36"/>
-          <w:szCs w:val="28"/>
-        </w:rPr>
-        <w:t>header/footer</w:t>
-      </w:r>
-      <w:r>
-        <w:rPr>
-          <w:rFonts w:hint="cs"/>
-          <w:sz w:val="36"/>
-          <w:szCs w:val="28"/>
-          <w:rtl/>
-        </w:rPr>
-        <w:t xml:space="preserve"> אוטומטי</w:t>
+    </w:p>
+    <w:p>
+      <w:pPr>
+        <w:bidi/>
+        <w:rPr>
+          <w:rtl/>
+        </w:rPr>
+      </w:pPr>
+      <w:r>
+        <w:rPr>
+          <w:rFonts w:cs="Arial"/>
+          <w:rtl/>
+        </w:rPr>
+        <w:lastRenderedPageBreak/>
+        <w:drawing>
+          <wp:inline distT="0" distB="0" distL="0" distR="0" wp14:anchorId="1A6CB348" wp14:editId="2D4DF4AF">
+            <wp:extent cx="5486400" cy="2729865"/>
+            <wp:effectExtent l="0" t="0" r="0" b="0"/>
+            <wp:docPr id="3" name="Picture 3"/>
+            <wp:cNvGraphicFramePr>
+              <a:graphicFrameLocks xmlns:a="http://schemas.openxmlformats.org/drawingml/2006/main" noChangeAspect="1"/>
+            </wp:cNvGraphicFramePr>
+            <a:graphic xmlns:a="http://schemas.openxmlformats.org/drawingml/2006/main">
+              <a:graphicData uri="http://schemas.openxmlformats.org/drawingml/2006/picture">
+                <pic:pic xmlns:pic="http://schemas.openxmlformats.org/drawingml/2006/picture">
+                  <pic:nvPicPr>
+                    <pic:cNvPr id="1" name=""/>
+                    <pic:cNvPicPr/>
+                  </pic:nvPicPr>
+                  <pic:blipFill>
+                    <a:blip r:embed="rId11"/>
+                    <a:stretch>
+                      <a:fillRect/>
+                    </a:stretch>
+                  </pic:blipFill>
+                  <pic:spPr>
+                    <a:xfrm>
+                      <a:off x="0" y="0"/>
+                      <a:ext cx="5486400" cy="2729865"/>
+                    </a:xfrm>
+                    <a:prstGeom prst="rect">
+                      <a:avLst/>
+                    </a:prstGeom>
+                  </pic:spPr>
+                </pic:pic>
+              </a:graphicData>
+            </a:graphic>
+          </wp:inline>
+        </w:drawing>
+      </w:r>
+    </w:p>
+    <w:p>
+      <w:pPr>
+        <w:bidi/>
+        <w:rPr>
+          <w:rtl/>
+        </w:rPr>
+      </w:pPr>
+    </w:p>
+    <w:p>
+      <w:pPr>
+        <w:bidi/>
+        <w:rPr>
+          <w:sz w:val="26"/>
+          <w:szCs w:val="28"/>
+          <w:rtl/>
+        </w:rPr>
+      </w:pPr>
+      <w:r>
+        <w:rPr>
+          <w:rFonts w:hint="cs"/>
+          <w:sz w:val="26"/>
+          <w:szCs w:val="28"/>
+          <w:rtl/>
+        </w:rPr>
+        <w:t>גלרייה של מוצרים:</w:t>
+      </w:r>
+    </w:p>
+    <w:p>
+      <w:pPr>
+        <w:bidi/>
+        <w:rPr>
+          <w:sz w:val="26"/>
+          <w:szCs w:val="28"/>
+          <w:rtl/>
+        </w:rPr>
+      </w:pPr>
+      <w:r>
+        <w:rPr>
+          <w:rFonts w:hint="cs"/>
+          <w:sz w:val="26"/>
+          <w:szCs w:val="28"/>
+          <w:rtl/>
+        </w:rPr>
+        <w:t xml:space="preserve">זה נמצא </w:t>
+      </w:r>
+      <w:r>
+        <w:rPr>
+          <w:sz w:val="26"/>
+          <w:szCs w:val="28"/>
+        </w:rPr>
+        <w:t>hardcoded</w:t>
+      </w:r>
+      <w:r>
+        <w:rPr>
+          <w:rFonts w:hint="cs"/>
+          <w:sz w:val="26"/>
+          <w:szCs w:val="28"/>
+          <w:rtl/>
+        </w:rPr>
+        <w:t xml:space="preserve"> בעמודים של בגדים\טיסות\אטרקציות ועובד בדיוק אותו דבר בכולם.</w:t>
+      </w:r>
+      <w:r>
+        <w:rPr>
+          <w:rFonts w:hint="cs"/>
+          <w:sz w:val="26"/>
+          <w:szCs w:val="28"/>
+          <w:rtl/>
+        </w:rPr>
+        <w:t xml:space="preserve"> כדי לא להכין ידנית את כל הרשימת מוצרים ולתת דרך קצת יותר דינאמית להכניס מוצרים חדשים הכנו קוד שמשתמש במערך </w:t>
+      </w:r>
+      <w:r>
+        <w:rPr>
+          <w:rFonts w:cs="Arial"/>
+          <w:sz w:val="26"/>
+          <w:szCs w:val="28"/>
+          <w:rtl/>
+        </w:rPr>
+        <w:drawing>
+          <wp:inline distT="0" distB="0" distL="0" distR="0" wp14:anchorId="6C80773D" wp14:editId="78E889D3">
+            <wp:extent cx="5486400" cy="3173730"/>
+            <wp:effectExtent l="0" t="0" r="0" b="7620"/>
+            <wp:docPr id="5" name="Picture 5"/>
+            <wp:cNvGraphicFramePr>
+              <a:graphicFrameLocks xmlns:a="http://schemas.openxmlformats.org/drawingml/2006/main" noChangeAspect="1"/>
+            </wp:cNvGraphicFramePr>
+            <a:graphic xmlns:a="http://schemas.openxmlformats.org/drawingml/2006/main">
+              <a:graphicData uri="http://schemas.openxmlformats.org/drawingml/2006/picture">
+                <pic:pic xmlns:pic="http://schemas.openxmlformats.org/drawingml/2006/picture">
+                  <pic:nvPicPr>
+                    <pic:cNvPr id="1" name=""/>
+                    <pic:cNvPicPr/>
+                  </pic:nvPicPr>
+                  <pic:blipFill>
+                    <a:blip r:embed="rId12"/>
+                    <a:stretch>
+                      <a:fillRect/>
+                    </a:stretch>
+                  </pic:blipFill>
+                  <pic:spPr>
+                    <a:xfrm>
+                      <a:off x="0" y="0"/>
+                      <a:ext cx="5486400" cy="3173730"/>
+                    </a:xfrm>
+                    <a:prstGeom prst="rect">
+                      <a:avLst/>
+                    </a:prstGeom>
+                  </pic:spPr>
+                </pic:pic>
+              </a:graphicData>
+            </a:graphic>
+          </wp:inline>
+        </w:drawing>
+      </w:r>
+    </w:p>
+    <w:p>
+      <w:pPr>
+        <w:bidi/>
+        <w:rPr>
+          <w:rtl/>
+        </w:rPr>
+      </w:pPr>
+      <w:r>
+        <w:rPr>
+          <w:rFonts w:hint="cs"/>
+          <w:rtl/>
+        </w:rPr>
+        <w:t>בקוד עצמו אנחנו מכינים את האלמנטים עם תוכן לפי מה שבמערך ומציגים אותו.</w:t>
+      </w:r>
+    </w:p>
+    <w:p>
+      <w:pPr>
+        <w:bidi/>
+        <w:rPr>
+          <w:rFonts w:hint="cs"/>
+          <w:rtl/>
+        </w:rPr>
+      </w:pPr>
+      <w:r>
+        <w:rPr>
+          <w:rFonts w:cs="Arial"/>
+          <w:rtl/>
+        </w:rPr>
+        <w:lastRenderedPageBreak/>
+        <w:drawing>
+          <wp:inline distT="0" distB="0" distL="0" distR="0" wp14:anchorId="1D32BEB3" wp14:editId="73E9BE44">
+            <wp:extent cx="5486400" cy="3453130"/>
+            <wp:effectExtent l="0" t="0" r="0" b="0"/>
+            <wp:docPr id="6" name="Picture 6"/>
+            <wp:cNvGraphicFramePr>
+              <a:graphicFrameLocks xmlns:a="http://schemas.openxmlformats.org/drawingml/2006/main" noChangeAspect="1"/>
+            </wp:cNvGraphicFramePr>
+            <a:graphic xmlns:a="http://schemas.openxmlformats.org/drawingml/2006/main">
+              <a:graphicData uri="http://schemas.openxmlformats.org/drawingml/2006/picture">
+                <pic:pic xmlns:pic="http://schemas.openxmlformats.org/drawingml/2006/picture">
+                  <pic:nvPicPr>
+                    <pic:cNvPr id="1" name=""/>
+                    <pic:cNvPicPr/>
+                  </pic:nvPicPr>
+                  <pic:blipFill>
+                    <a:blip r:embed="rId13"/>
+                    <a:stretch>
+                      <a:fillRect/>
+                    </a:stretch>
+                  </pic:blipFill>
+                  <pic:spPr>
+                    <a:xfrm>
+                      <a:off x="0" y="0"/>
+                      <a:ext cx="5486400" cy="3453130"/>
+                    </a:xfrm>
+                    <a:prstGeom prst="rect">
+                      <a:avLst/>
+                    </a:prstGeom>
+                  </pic:spPr>
+                </pic:pic>
+              </a:graphicData>
+            </a:graphic>
+          </wp:inline>
+        </w:drawing>
       </w:r>
     </w:p>
     <w:sectPr>
-      <w:footerReference w:type="default" r:id="rId7"/>
+      <w:footerReference w:type="default" r:id="rId14"/>
       <w:pgSz w:w="12240" w:h="15840"/>
       <w:pgMar w:top="1440" w:right="1800" w:bottom="1440" w:left="1800" w:header="720" w:footer="720" w:gutter="0"/>
       <w:pgNumType w:start="0"/>
@@ -5368,6 +6244,95 @@
     </w:lvl>
   </w:abstractNum>
   <w:abstractNum w:abstractNumId="1" w15:restartNumberingAfterBreak="0">
+    <w:nsid w:val="0B697ED2"/>
+    <w:multiLevelType w:val="hybridMultilevel"/>
+    <w:tmpl w:val="06AC73A4"/>
+    <w:lvl w:ilvl="0" w:tplc="2000000F">
+      <w:start w:val="1"/>
+      <w:numFmt w:val="decimal"/>
+      <w:lvlText w:val="%1."/>
+      <w:lvlJc w:val="left"/>
+      <w:pPr>
+        <w:ind w:left="720" w:hanging="360"/>
+      </w:pPr>
+      <w:rPr>
+        <w:rFonts w:hint="default"/>
+      </w:rPr>
+    </w:lvl>
+    <w:lvl w:ilvl="1" w:tplc="20000019" w:tentative="1">
+      <w:start w:val="1"/>
+      <w:numFmt w:val="lowerLetter"/>
+      <w:lvlText w:val="%2."/>
+      <w:lvlJc w:val="left"/>
+      <w:pPr>
+        <w:ind w:left="1440" w:hanging="360"/>
+      </w:pPr>
+    </w:lvl>
+    <w:lvl w:ilvl="2" w:tplc="2000001B" w:tentative="1">
+      <w:start w:val="1"/>
+      <w:numFmt w:val="lowerRoman"/>
+      <w:lvlText w:val="%3."/>
+      <w:lvlJc w:val="right"/>
+      <w:pPr>
+        <w:ind w:left="2160" w:hanging="180"/>
+      </w:pPr>
+    </w:lvl>
+    <w:lvl w:ilvl="3" w:tplc="2000000F" w:tentative="1">
+      <w:start w:val="1"/>
+      <w:numFmt w:val="decimal"/>
+      <w:lvlText w:val="%4."/>
+      <w:lvlJc w:val="left"/>
+      <w:pPr>
+        <w:ind w:left="2880" w:hanging="360"/>
+      </w:pPr>
+    </w:lvl>
+    <w:lvl w:ilvl="4" w:tplc="20000019" w:tentative="1">
+      <w:start w:val="1"/>
+      <w:numFmt w:val="lowerLetter"/>
+      <w:lvlText w:val="%5."/>
+      <w:lvlJc w:val="left"/>
+      <w:pPr>
+        <w:ind w:left="3600" w:hanging="360"/>
+      </w:pPr>
+    </w:lvl>
+    <w:lvl w:ilvl="5" w:tplc="2000001B" w:tentative="1">
+      <w:start w:val="1"/>
+      <w:numFmt w:val="lowerRoman"/>
+      <w:lvlText w:val="%6."/>
+      <w:lvlJc w:val="right"/>
+      <w:pPr>
+        <w:ind w:left="4320" w:hanging="180"/>
+      </w:pPr>
+    </w:lvl>
+    <w:lvl w:ilvl="6" w:tplc="2000000F" w:tentative="1">
+      <w:start w:val="1"/>
+      <w:numFmt w:val="decimal"/>
+      <w:lvlText w:val="%7."/>
+      <w:lvlJc w:val="left"/>
+      <w:pPr>
+        <w:ind w:left="5040" w:hanging="360"/>
+      </w:pPr>
+    </w:lvl>
+    <w:lvl w:ilvl="7" w:tplc="20000019" w:tentative="1">
+      <w:start w:val="1"/>
+      <w:numFmt w:val="lowerLetter"/>
+      <w:lvlText w:val="%8."/>
+      <w:lvlJc w:val="left"/>
+      <w:pPr>
+        <w:ind w:left="5760" w:hanging="360"/>
+      </w:pPr>
+    </w:lvl>
+    <w:lvl w:ilvl="8" w:tplc="2000001B" w:tentative="1">
+      <w:start w:val="1"/>
+      <w:numFmt w:val="lowerRoman"/>
+      <w:lvlText w:val="%9."/>
+      <w:lvlJc w:val="right"/>
+      <w:pPr>
+        <w:ind w:left="6480" w:hanging="180"/>
+      </w:pPr>
+    </w:lvl>
+  </w:abstractNum>
+  <w:abstractNum w:abstractNumId="2" w15:restartNumberingAfterBreak="0">
     <w:nsid w:val="0F5A3071"/>
     <w:multiLevelType w:val="hybridMultilevel"/>
     <w:tmpl w:val="2AAC6B64"/>
@@ -5456,7 +6421,7 @@
       </w:pPr>
     </w:lvl>
   </w:abstractNum>
-  <w:abstractNum w:abstractNumId="2" w15:restartNumberingAfterBreak="0">
+  <w:abstractNum w:abstractNumId="3" w15:restartNumberingAfterBreak="0">
     <w:nsid w:val="1EA01AA9"/>
     <w:multiLevelType w:val="hybridMultilevel"/>
     <w:tmpl w:val="4644F62E"/>
@@ -5545,7 +6510,7 @@
       </w:pPr>
     </w:lvl>
   </w:abstractNum>
-  <w:abstractNum w:abstractNumId="3" w15:restartNumberingAfterBreak="0">
+  <w:abstractNum w:abstractNumId="4" w15:restartNumberingAfterBreak="0">
     <w:nsid w:val="1F640177"/>
     <w:multiLevelType w:val="hybridMultilevel"/>
     <w:tmpl w:val="618A7548"/>
@@ -5634,7 +6599,7 @@
       </w:pPr>
     </w:lvl>
   </w:abstractNum>
-  <w:abstractNum w:abstractNumId="4" w15:restartNumberingAfterBreak="0">
+  <w:abstractNum w:abstractNumId="5" w15:restartNumberingAfterBreak="0">
     <w:nsid w:val="24CC549C"/>
     <w:multiLevelType w:val="hybridMultilevel"/>
     <w:tmpl w:val="BAACF100"/>
@@ -5747,7 +6712,7 @@
       </w:rPr>
     </w:lvl>
   </w:abstractNum>
-  <w:abstractNum w:abstractNumId="5" w15:restartNumberingAfterBreak="0">
+  <w:abstractNum w:abstractNumId="6" w15:restartNumberingAfterBreak="0">
     <w:nsid w:val="313F0C21"/>
     <w:multiLevelType w:val="hybridMultilevel"/>
     <w:tmpl w:val="490E2654"/>
@@ -5836,7 +6801,7 @@
       </w:pPr>
     </w:lvl>
   </w:abstractNum>
-  <w:abstractNum w:abstractNumId="6" w15:restartNumberingAfterBreak="0">
+  <w:abstractNum w:abstractNumId="7" w15:restartNumberingAfterBreak="0">
     <w:nsid w:val="3E3F2584"/>
     <w:multiLevelType w:val="hybridMultilevel"/>
     <w:tmpl w:val="8EF61F7A"/>
@@ -5925,7 +6890,7 @@
       </w:pPr>
     </w:lvl>
   </w:abstractNum>
-  <w:abstractNum w:abstractNumId="7" w15:restartNumberingAfterBreak="0">
+  <w:abstractNum w:abstractNumId="8" w15:restartNumberingAfterBreak="0">
     <w:nsid w:val="465727C2"/>
     <w:multiLevelType w:val="hybridMultilevel"/>
     <w:tmpl w:val="7C6A846E"/>
@@ -6014,7 +6979,7 @@
       </w:pPr>
     </w:lvl>
   </w:abstractNum>
-  <w:abstractNum w:abstractNumId="8" w15:restartNumberingAfterBreak="0">
+  <w:abstractNum w:abstractNumId="9" w15:restartNumberingAfterBreak="0">
     <w:nsid w:val="4C301EAB"/>
     <w:multiLevelType w:val="hybridMultilevel"/>
     <w:tmpl w:val="2F46D4C4"/>
@@ -6103,7 +7068,120 @@
       </w:pPr>
     </w:lvl>
   </w:abstractNum>
-  <w:abstractNum w:abstractNumId="9" w15:restartNumberingAfterBreak="0">
+  <w:abstractNum w:abstractNumId="10" w15:restartNumberingAfterBreak="0">
+    <w:nsid w:val="4F537C0B"/>
+    <w:multiLevelType w:val="hybridMultilevel"/>
+    <w:tmpl w:val="05E0B1E6"/>
+    <w:lvl w:ilvl="0" w:tplc="20000001">
+      <w:start w:val="1"/>
+      <w:numFmt w:val="bullet"/>
+      <w:lvlText w:val=""/>
+      <w:lvlJc w:val="left"/>
+      <w:pPr>
+        <w:ind w:left="720" w:hanging="360"/>
+      </w:pPr>
+      <w:rPr>
+        <w:rFonts w:ascii="Symbol" w:hAnsi="Symbol" w:hint="default"/>
+      </w:rPr>
+    </w:lvl>
+    <w:lvl w:ilvl="1" w:tplc="20000003" w:tentative="1">
+      <w:start w:val="1"/>
+      <w:numFmt w:val="bullet"/>
+      <w:lvlText w:val="o"/>
+      <w:lvlJc w:val="left"/>
+      <w:pPr>
+        <w:ind w:left="1440" w:hanging="360"/>
+      </w:pPr>
+      <w:rPr>
+        <w:rFonts w:ascii="Courier New" w:hAnsi="Courier New" w:cs="Courier New" w:hint="default"/>
+      </w:rPr>
+    </w:lvl>
+    <w:lvl w:ilvl="2" w:tplc="20000005" w:tentative="1">
+      <w:start w:val="1"/>
+      <w:numFmt w:val="bullet"/>
+      <w:lvlText w:val=""/>
+      <w:lvlJc w:val="left"/>
+      <w:pPr>
+        <w:ind w:left="2160" w:hanging="360"/>
+      </w:pPr>
+      <w:rPr>
+        <w:rFonts w:ascii="Wingdings" w:hAnsi="Wingdings" w:hint="default"/>
+      </w:rPr>
+    </w:lvl>
+    <w:lvl w:ilvl="3" w:tplc="20000001" w:tentative="1">
+      <w:start w:val="1"/>
+      <w:numFmt w:val="bullet"/>
+      <w:lvlText w:val=""/>
+      <w:lvlJc w:val="left"/>
+      <w:pPr>
+        <w:ind w:left="2880" w:hanging="360"/>
+      </w:pPr>
+      <w:rPr>
+        <w:rFonts w:ascii="Symbol" w:hAnsi="Symbol" w:hint="default"/>
+      </w:rPr>
+    </w:lvl>
+    <w:lvl w:ilvl="4" w:tplc="20000003" w:tentative="1">
+      <w:start w:val="1"/>
+      <w:numFmt w:val="bullet"/>
+      <w:lvlText w:val="o"/>
+      <w:lvlJc w:val="left"/>
+      <w:pPr>
+        <w:ind w:left="3600" w:hanging="360"/>
+      </w:pPr>
+      <w:rPr>
+        <w:rFonts w:ascii="Courier New" w:hAnsi="Courier New" w:cs="Courier New" w:hint="default"/>
+      </w:rPr>
+    </w:lvl>
+    <w:lvl w:ilvl="5" w:tplc="20000005" w:tentative="1">
+      <w:start w:val="1"/>
+      <w:numFmt w:val="bullet"/>
+      <w:lvlText w:val=""/>
+      <w:lvlJc w:val="left"/>
+      <w:pPr>
+        <w:ind w:left="4320" w:hanging="360"/>
+      </w:pPr>
+      <w:rPr>
+        <w:rFonts w:ascii="Wingdings" w:hAnsi="Wingdings" w:hint="default"/>
+      </w:rPr>
+    </w:lvl>
+    <w:lvl w:ilvl="6" w:tplc="20000001" w:tentative="1">
+      <w:start w:val="1"/>
+      <w:numFmt w:val="bullet"/>
+      <w:lvlText w:val=""/>
+      <w:lvlJc w:val="left"/>
+      <w:pPr>
+        <w:ind w:left="5040" w:hanging="360"/>
+      </w:pPr>
+      <w:rPr>
+        <w:rFonts w:ascii="Symbol" w:hAnsi="Symbol" w:hint="default"/>
+      </w:rPr>
+    </w:lvl>
+    <w:lvl w:ilvl="7" w:tplc="20000003" w:tentative="1">
+      <w:start w:val="1"/>
+      <w:numFmt w:val="bullet"/>
+      <w:lvlText w:val="o"/>
+      <w:lvlJc w:val="left"/>
+      <w:pPr>
+        <w:ind w:left="5760" w:hanging="360"/>
+      </w:pPr>
+      <w:rPr>
+        <w:rFonts w:ascii="Courier New" w:hAnsi="Courier New" w:cs="Courier New" w:hint="default"/>
+      </w:rPr>
+    </w:lvl>
+    <w:lvl w:ilvl="8" w:tplc="20000005" w:tentative="1">
+      <w:start w:val="1"/>
+      <w:numFmt w:val="bullet"/>
+      <w:lvlText w:val=""/>
+      <w:lvlJc w:val="left"/>
+      <w:pPr>
+        <w:ind w:left="6480" w:hanging="360"/>
+      </w:pPr>
+      <w:rPr>
+        <w:rFonts w:ascii="Wingdings" w:hAnsi="Wingdings" w:hint="default"/>
+      </w:rPr>
+    </w:lvl>
+  </w:abstractNum>
+  <w:abstractNum w:abstractNumId="11" w15:restartNumberingAfterBreak="0">
     <w:nsid w:val="564F6D2A"/>
     <w:multiLevelType w:val="hybridMultilevel"/>
     <w:tmpl w:val="618A7548"/>
@@ -6192,7 +7270,7 @@
       </w:pPr>
     </w:lvl>
   </w:abstractNum>
-  <w:abstractNum w:abstractNumId="10" w15:restartNumberingAfterBreak="0">
+  <w:abstractNum w:abstractNumId="12" w15:restartNumberingAfterBreak="0">
     <w:nsid w:val="63446E08"/>
     <w:multiLevelType w:val="hybridMultilevel"/>
     <w:tmpl w:val="618A7548"/>
@@ -6281,7 +7359,7 @@
       </w:pPr>
     </w:lvl>
   </w:abstractNum>
-  <w:abstractNum w:abstractNumId="11" w15:restartNumberingAfterBreak="0">
+  <w:abstractNum w:abstractNumId="13" w15:restartNumberingAfterBreak="0">
     <w:nsid w:val="66B86DF0"/>
     <w:multiLevelType w:val="hybridMultilevel"/>
     <w:tmpl w:val="E73EE518"/>
@@ -6370,7 +7448,7 @@
       </w:pPr>
     </w:lvl>
   </w:abstractNum>
-  <w:abstractNum w:abstractNumId="12" w15:restartNumberingAfterBreak="0">
+  <w:abstractNum w:abstractNumId="14" w15:restartNumberingAfterBreak="0">
     <w:nsid w:val="6FF44586"/>
     <w:multiLevelType w:val="hybridMultilevel"/>
     <w:tmpl w:val="34C01B5A"/>
@@ -6459,7 +7537,7 @@
       </w:pPr>
     </w:lvl>
   </w:abstractNum>
-  <w:abstractNum w:abstractNumId="13" w15:restartNumberingAfterBreak="0">
+  <w:abstractNum w:abstractNumId="15" w15:restartNumberingAfterBreak="0">
     <w:nsid w:val="746D5D0F"/>
     <w:multiLevelType w:val="hybridMultilevel"/>
     <w:tmpl w:val="E73EE518"/>
@@ -6548,7 +7626,96 @@
       </w:pPr>
     </w:lvl>
   </w:abstractNum>
-  <w:abstractNum w:abstractNumId="14" w15:restartNumberingAfterBreak="0">
+  <w:abstractNum w:abstractNumId="16" w15:restartNumberingAfterBreak="0">
+    <w:nsid w:val="7A611B83"/>
+    <w:multiLevelType w:val="hybridMultilevel"/>
+    <w:tmpl w:val="618A7548"/>
+    <w:lvl w:ilvl="0" w:tplc="FFFFFFFF">
+      <w:start w:val="1"/>
+      <w:numFmt w:val="decimal"/>
+      <w:lvlText w:val="%1."/>
+      <w:lvlJc w:val="left"/>
+      <w:pPr>
+        <w:ind w:left="720" w:hanging="360"/>
+      </w:pPr>
+      <w:rPr>
+        <w:rFonts w:hint="default"/>
+      </w:rPr>
+    </w:lvl>
+    <w:lvl w:ilvl="1" w:tplc="FFFFFFFF" w:tentative="1">
+      <w:start w:val="1"/>
+      <w:numFmt w:val="lowerLetter"/>
+      <w:lvlText w:val="%2."/>
+      <w:lvlJc w:val="left"/>
+      <w:pPr>
+        <w:ind w:left="1440" w:hanging="360"/>
+      </w:pPr>
+    </w:lvl>
+    <w:lvl w:ilvl="2" w:tplc="FFFFFFFF" w:tentative="1">
+      <w:start w:val="1"/>
+      <w:numFmt w:val="lowerRoman"/>
+      <w:lvlText w:val="%3."/>
+      <w:lvlJc w:val="right"/>
+      <w:pPr>
+        <w:ind w:left="2160" w:hanging="180"/>
+      </w:pPr>
+    </w:lvl>
+    <w:lvl w:ilvl="3" w:tplc="FFFFFFFF" w:tentative="1">
+      <w:start w:val="1"/>
+      <w:numFmt w:val="decimal"/>
+      <w:lvlText w:val="%4."/>
+      <w:lvlJc w:val="left"/>
+      <w:pPr>
+        <w:ind w:left="2880" w:hanging="360"/>
+      </w:pPr>
+    </w:lvl>
+    <w:lvl w:ilvl="4" w:tplc="FFFFFFFF" w:tentative="1">
+      <w:start w:val="1"/>
+      <w:numFmt w:val="lowerLetter"/>
+      <w:lvlText w:val="%5."/>
+      <w:lvlJc w:val="left"/>
+      <w:pPr>
+        <w:ind w:left="3600" w:hanging="360"/>
+      </w:pPr>
+    </w:lvl>
+    <w:lvl w:ilvl="5" w:tplc="FFFFFFFF" w:tentative="1">
+      <w:start w:val="1"/>
+      <w:numFmt w:val="lowerRoman"/>
+      <w:lvlText w:val="%6."/>
+      <w:lvlJc w:val="right"/>
+      <w:pPr>
+        <w:ind w:left="4320" w:hanging="180"/>
+      </w:pPr>
+    </w:lvl>
+    <w:lvl w:ilvl="6" w:tplc="FFFFFFFF" w:tentative="1">
+      <w:start w:val="1"/>
+      <w:numFmt w:val="decimal"/>
+      <w:lvlText w:val="%7."/>
+      <w:lvlJc w:val="left"/>
+      <w:pPr>
+        <w:ind w:left="5040" w:hanging="360"/>
+      </w:pPr>
+    </w:lvl>
+    <w:lvl w:ilvl="7" w:tplc="FFFFFFFF" w:tentative="1">
+      <w:start w:val="1"/>
+      <w:numFmt w:val="lowerLetter"/>
+      <w:lvlText w:val="%8."/>
+      <w:lvlJc w:val="left"/>
+      <w:pPr>
+        <w:ind w:left="5760" w:hanging="360"/>
+      </w:pPr>
+    </w:lvl>
+    <w:lvl w:ilvl="8" w:tplc="FFFFFFFF" w:tentative="1">
+      <w:start w:val="1"/>
+      <w:numFmt w:val="lowerRoman"/>
+      <w:lvlText w:val="%9."/>
+      <w:lvlJc w:val="right"/>
+      <w:pPr>
+        <w:ind w:left="6480" w:hanging="180"/>
+      </w:pPr>
+    </w:lvl>
+  </w:abstractNum>
+  <w:abstractNum w:abstractNumId="17" w15:restartNumberingAfterBreak="0">
     <w:nsid w:val="7D7B2A44"/>
     <w:multiLevelType w:val="hybridMultilevel"/>
     <w:tmpl w:val="618A7548"/>
@@ -6638,49 +7805,58 @@
     </w:lvl>
   </w:abstractNum>
   <w:num w:numId="1">
+    <w:abstractNumId w:val="9"/>
+  </w:num>
+  <w:num w:numId="2">
+    <w:abstractNumId w:val="13"/>
+  </w:num>
+  <w:num w:numId="3">
     <w:abstractNumId w:val="8"/>
   </w:num>
-  <w:num w:numId="2">
+  <w:num w:numId="4">
+    <w:abstractNumId w:val="7"/>
+  </w:num>
+  <w:num w:numId="5">
+    <w:abstractNumId w:val="3"/>
+  </w:num>
+  <w:num w:numId="6">
+    <w:abstractNumId w:val="6"/>
+  </w:num>
+  <w:num w:numId="7">
+    <w:abstractNumId w:val="15"/>
+  </w:num>
+  <w:num w:numId="8">
+    <w:abstractNumId w:val="4"/>
+  </w:num>
+  <w:num w:numId="9">
+    <w:abstractNumId w:val="14"/>
+  </w:num>
+  <w:num w:numId="10">
+    <w:abstractNumId w:val="17"/>
+  </w:num>
+  <w:num w:numId="11">
     <w:abstractNumId w:val="11"/>
   </w:num>
-  <w:num w:numId="3">
-    <w:abstractNumId w:val="7"/>
-  </w:num>
-  <w:num w:numId="4">
-    <w:abstractNumId w:val="6"/>
-  </w:num>
-  <w:num w:numId="5">
+  <w:num w:numId="12">
     <w:abstractNumId w:val="2"/>
   </w:num>
-  <w:num w:numId="6">
-    <w:abstractNumId w:val="5"/>
-  </w:num>
-  <w:num w:numId="7">
-    <w:abstractNumId w:val="13"/>
-  </w:num>
-  <w:num w:numId="8">
-    <w:abstractNumId w:val="3"/>
-  </w:num>
-  <w:num w:numId="9">
+  <w:num w:numId="13">
     <w:abstractNumId w:val="12"/>
   </w:num>
-  <w:num w:numId="10">
-    <w:abstractNumId w:val="14"/>
-  </w:num>
-  <w:num w:numId="11">
-    <w:abstractNumId w:val="9"/>
-  </w:num>
-  <w:num w:numId="12">
-    <w:abstractNumId w:val="1"/>
-  </w:num>
-  <w:num w:numId="13">
-    <w:abstractNumId w:val="10"/>
-  </w:num>
   <w:num w:numId="14">
-    <w:abstractNumId w:val="4"/>
+    <w:abstractNumId w:val="5"/>
   </w:num>
   <w:num w:numId="15">
     <w:abstractNumId w:val="0"/>
+  </w:num>
+  <w:num w:numId="16">
+    <w:abstractNumId w:val="10"/>
+  </w:num>
+  <w:num w:numId="17">
+    <w:abstractNumId w:val="16"/>
+  </w:num>
+  <w:num w:numId="18">
+    <w:abstractNumId w:val="1"/>
   </w:num>
 </w:numbering>
 </file>
@@ -7288,7 +8464,6 @@
   <w:style w:type="character" w:default="1" w:styleId="DefaultParagraphFont">
     <w:name w:val="Default Paragraph Font"/>
     <w:uiPriority w:val="1"/>
-    <w:semiHidden/>
     <w:unhideWhenUsed/>
   </w:style>
   <w:style w:type="table" w:default="1" w:styleId="TableNormal">
@@ -7646,6 +8821,23 @@
     <w:uiPriority w:val="99"/>
     <w:rsid w:val="00CD6EBF"/>
   </w:style>
+  <w:style w:type="paragraph" w:styleId="NormalWeb">
+    <w:name w:val="Normal (Web)"/>
+    <w:basedOn w:val="Normal"/>
+    <w:uiPriority w:val="99"/>
+    <w:semiHidden/>
+    <w:unhideWhenUsed/>
+    <w:rsid w:val="0098093E"/>
+    <w:pPr>
+      <w:spacing w:before="100" w:beforeAutospacing="1" w:after="100" w:afterAutospacing="1" w:line="240" w:lineRule="auto"/>
+    </w:pPr>
+    <w:rPr>
+      <w:rFonts w:ascii="Times New Roman" w:eastAsia="Times New Roman" w:hAnsi="Times New Roman" w:cs="Times New Roman"/>
+      <w:kern w:val="0"/>
+      <w:lang w:val="en-IL" w:eastAsia="en-IL"/>
+      <w14:ligatures w14:val="none"/>
+    </w:rPr>
+  </w:style>
 </w:styles>
 </file>
 
@@ -7962,4 +9154,16 @@
     </a:ext>
   </a:extLst>
 </a:theme>
+</file>
+
+<file path=customXml/item1.xml><?xml version="1.0" encoding="utf-8"?>
+<b:Sources xmlns:b="http://schemas.openxmlformats.org/officeDocument/2006/bibliography" xmlns="http://schemas.openxmlformats.org/officeDocument/2006/bibliography" SelectedStyle="\APASixthEditionOfficeOnline.xsl" StyleName="APA" Version="6"/>
+</file>
+
+<file path=customXml/itemProps1.xml><?xml version="1.0" encoding="utf-8"?>
+<ds:datastoreItem xmlns:ds="http://schemas.openxmlformats.org/officeDocument/2006/customXml" ds:itemID="{AEA2E23E-D762-47C4-A0EB-ECD0592C3569}">
+  <ds:schemaRefs>
+    <ds:schemaRef ds:uri="http://schemas.openxmlformats.org/officeDocument/2006/bibliography"/>
+  </ds:schemaRefs>
+</ds:datastoreItem>
 </file>
</xml_diff>